<commit_message>
Added Tailwind and TypeScript
</commit_message>
<xml_diff>
--- a/note/MicroServices.docx
+++ b/note/MicroServices.docx
@@ -20,14 +20,46 @@
           <w:b/>
           <w:lang w:val="en-IN"/>
         </w:rPr>
-        <w:t>Explain MicroService Architecture</w:t>
-      </w:r>
+        <w:t xml:space="preserve">Explain </w:t>
+      </w:r>
+      <w:proofErr w:type="spellStart"/>
       <w:r>
         <w:rPr>
           <w:b/>
           <w:lang w:val="en-IN"/>
         </w:rPr>
-        <w:t xml:space="preserve"> and Monlithic Architecture</w:t>
+        <w:t>MicroService</w:t>
+      </w:r>
+      <w:proofErr w:type="spellEnd"/>
+      <w:r>
+        <w:rPr>
+          <w:b/>
+          <w:lang w:val="en-IN"/>
+        </w:rPr>
+        <w:t xml:space="preserve"> Architecture</w:t>
+      </w:r>
+      <w:r>
+        <w:rPr>
+          <w:b/>
+          <w:lang w:val="en-IN"/>
+        </w:rPr>
+        <w:t xml:space="preserve"> and </w:t>
+      </w:r>
+      <w:proofErr w:type="spellStart"/>
+      <w:r>
+        <w:rPr>
+          <w:b/>
+          <w:lang w:val="en-IN"/>
+        </w:rPr>
+        <w:t>Monlithic</w:t>
+      </w:r>
+      <w:proofErr w:type="spellEnd"/>
+      <w:r>
+        <w:rPr>
+          <w:b/>
+          <w:lang w:val="en-IN"/>
+        </w:rPr>
+        <w:t xml:space="preserve"> Architecture</w:t>
       </w:r>
     </w:p>
     <w:p>
@@ -41,11 +73,27 @@
           <w:lang w:val="en-IN"/>
         </w:rPr>
       </w:pPr>
-      <w:r>
-        <w:rPr>
-          <w:lang w:val="en-IN"/>
-        </w:rPr>
-        <w:t>Microservice : Here we build our application by breaking it down into smaller pieces which can be independently developed, deployed &amp; maintained.</w:t>
+      <w:proofErr w:type="spellStart"/>
+      <w:proofErr w:type="gramStart"/>
+      <w:r>
+        <w:rPr>
+          <w:lang w:val="en-IN"/>
+        </w:rPr>
+        <w:t>Microservice</w:t>
+      </w:r>
+      <w:proofErr w:type="spellEnd"/>
+      <w:r>
+        <w:rPr>
+          <w:lang w:val="en-IN"/>
+        </w:rPr>
+        <w:t xml:space="preserve"> :</w:t>
+      </w:r>
+      <w:proofErr w:type="gramEnd"/>
+      <w:r>
+        <w:rPr>
+          <w:lang w:val="en-IN"/>
+        </w:rPr>
+        <w:t xml:space="preserve"> Here we build our application by breaking it down into smaller pieces which can be independently developed, deployed &amp; maintained.</w:t>
       </w:r>
     </w:p>
     <w:p>
@@ -59,11 +107,19 @@
           <w:lang w:val="en-IN"/>
         </w:rPr>
       </w:pPr>
-      <w:r>
-        <w:rPr>
-          <w:lang w:val="en-IN"/>
-        </w:rPr>
-        <w:t>Monolithic : Here our application gets build and deployed as single unit.</w:t>
+      <w:proofErr w:type="gramStart"/>
+      <w:r>
+        <w:rPr>
+          <w:lang w:val="en-IN"/>
+        </w:rPr>
+        <w:t>Monolithic :</w:t>
+      </w:r>
+      <w:proofErr w:type="gramEnd"/>
+      <w:r>
+        <w:rPr>
+          <w:lang w:val="en-IN"/>
+        </w:rPr>
+        <w:t xml:space="preserve"> Here our application gets build and deployed as single unit.</w:t>
       </w:r>
       <w:r>
         <w:rPr>
@@ -89,11 +145,19 @@
         </w:rPr>
         <w:t xml:space="preserve">of our application </w:t>
       </w:r>
-      <w:r>
-        <w:rPr>
-          <w:lang w:val="en-IN"/>
-        </w:rPr>
-        <w:t>are clubbed inside single package.</w:t>
+      <w:proofErr w:type="gramStart"/>
+      <w:r>
+        <w:rPr>
+          <w:lang w:val="en-IN"/>
+        </w:rPr>
+        <w:t>are</w:t>
+      </w:r>
+      <w:proofErr w:type="gramEnd"/>
+      <w:r>
+        <w:rPr>
+          <w:lang w:val="en-IN"/>
+        </w:rPr>
+        <w:t xml:space="preserve"> clubbed inside single package.</w:t>
       </w:r>
     </w:p>
     <w:p>
@@ -121,14 +185,30 @@
           <w:b/>
           <w:lang w:val="en-IN"/>
         </w:rPr>
-        <w:t>REST Template</w:t>
-      </w:r>
+        <w:t xml:space="preserve">REST </w:t>
+      </w:r>
+      <w:proofErr w:type="gramStart"/>
       <w:r>
         <w:rPr>
           <w:b/>
           <w:lang w:val="en-IN"/>
         </w:rPr>
-        <w:t xml:space="preserve"> : </w:t>
+        <w:t>Template</w:t>
+      </w:r>
+      <w:r>
+        <w:rPr>
+          <w:b/>
+          <w:lang w:val="en-IN"/>
+        </w:rPr>
+        <w:t xml:space="preserve"> :</w:t>
+      </w:r>
+      <w:proofErr w:type="gramEnd"/>
+      <w:r>
+        <w:rPr>
+          <w:b/>
+          <w:lang w:val="en-IN"/>
+        </w:rPr>
+        <w:t xml:space="preserve"> </w:t>
       </w:r>
       <w:r>
         <w:rPr>
@@ -170,19 +250,48 @@
         <w:rPr>
           <w:lang w:val="en-IN"/>
         </w:rPr>
-        <w:t xml:space="preserve"> getForObject</w:t>
-      </w:r>
-      <w:r>
-        <w:rPr>
-          <w:lang w:val="en-IN"/>
-        </w:rPr>
-        <w:t>() and postForObject()</w:t>
-      </w:r>
-      <w:r>
-        <w:rPr>
-          <w:lang w:val="en-IN"/>
-        </w:rPr>
-        <w:t xml:space="preserve"> which takes a ur</w:t>
+        <w:t xml:space="preserve"> </w:t>
+      </w:r>
+      <w:proofErr w:type="spellStart"/>
+      <w:r>
+        <w:rPr>
+          <w:lang w:val="en-IN"/>
+        </w:rPr>
+        <w:t>getForObject</w:t>
+      </w:r>
+      <w:proofErr w:type="spellEnd"/>
+      <w:r>
+        <w:rPr>
+          <w:lang w:val="en-IN"/>
+        </w:rPr>
+        <w:t xml:space="preserve">() and </w:t>
+      </w:r>
+      <w:proofErr w:type="spellStart"/>
+      <w:r>
+        <w:rPr>
+          <w:lang w:val="en-IN"/>
+        </w:rPr>
+        <w:t>postForObject</w:t>
+      </w:r>
+      <w:proofErr w:type="spellEnd"/>
+      <w:r>
+        <w:rPr>
+          <w:lang w:val="en-IN"/>
+        </w:rPr>
+        <w:t>()</w:t>
+      </w:r>
+      <w:r>
+        <w:rPr>
+          <w:lang w:val="en-IN"/>
+        </w:rPr>
+        <w:t xml:space="preserve"> which takes a </w:t>
+      </w:r>
+      <w:proofErr w:type="spellStart"/>
+      <w:r>
+        <w:rPr>
+          <w:lang w:val="en-IN"/>
+        </w:rPr>
+        <w:t>ur</w:t>
       </w:r>
       <w:r>
         <w:rPr>
@@ -190,23 +299,94 @@
         </w:rPr>
         <w:t>l</w:t>
       </w:r>
-      <w:r>
-        <w:rPr>
-          <w:lang w:val="en-IN"/>
-        </w:rPr>
-        <w:t xml:space="preserve"> and a class(eg. List.class)</w:t>
-      </w:r>
-      <w:r>
-        <w:rPr>
-          <w:lang w:val="en-IN"/>
-        </w:rPr>
-        <w:t xml:space="preserve"> and a body(in case of postForObject())</w:t>
-      </w:r>
-      <w:r>
-        <w:rPr>
-          <w:lang w:val="en-IN"/>
-        </w:rPr>
-        <w:t>. This class indicates the return type that we are expecting from service, that we have called</w:t>
+      <w:proofErr w:type="spellEnd"/>
+      <w:r>
+        <w:rPr>
+          <w:lang w:val="en-IN"/>
+        </w:rPr>
+        <w:t xml:space="preserve"> and a class(</w:t>
+      </w:r>
+      <w:proofErr w:type="spellStart"/>
+      <w:r>
+        <w:rPr>
+          <w:lang w:val="en-IN"/>
+        </w:rPr>
+        <w:t>eg</w:t>
+      </w:r>
+      <w:proofErr w:type="spellEnd"/>
+      <w:r>
+        <w:rPr>
+          <w:lang w:val="en-IN"/>
+        </w:rPr>
+        <w:t xml:space="preserve">. </w:t>
+      </w:r>
+      <w:proofErr w:type="spellStart"/>
+      <w:r>
+        <w:rPr>
+          <w:lang w:val="en-IN"/>
+        </w:rPr>
+        <w:t>List.class</w:t>
+      </w:r>
+      <w:proofErr w:type="spellEnd"/>
+      <w:r>
+        <w:rPr>
+          <w:lang w:val="en-IN"/>
+        </w:rPr>
+        <w:t>)</w:t>
+      </w:r>
+      <w:r>
+        <w:rPr>
+          <w:lang w:val="en-IN"/>
+        </w:rPr>
+        <w:t xml:space="preserve"> and a </w:t>
+      </w:r>
+      <w:proofErr w:type="gramStart"/>
+      <w:r>
+        <w:rPr>
+          <w:lang w:val="en-IN"/>
+        </w:rPr>
+        <w:t>body(</w:t>
+      </w:r>
+      <w:proofErr w:type="gramEnd"/>
+      <w:r>
+        <w:rPr>
+          <w:lang w:val="en-IN"/>
+        </w:rPr>
+        <w:t xml:space="preserve">in case of </w:t>
+      </w:r>
+      <w:proofErr w:type="spellStart"/>
+      <w:r>
+        <w:rPr>
+          <w:lang w:val="en-IN"/>
+        </w:rPr>
+        <w:t>postForObject</w:t>
+      </w:r>
+      <w:proofErr w:type="spellEnd"/>
+      <w:r>
+        <w:rPr>
+          <w:lang w:val="en-IN"/>
+        </w:rPr>
+        <w:t>())</w:t>
+      </w:r>
+      <w:r>
+        <w:rPr>
+          <w:lang w:val="en-IN"/>
+        </w:rPr>
+        <w:t xml:space="preserve">. This class indicates the return type that we are expecting from </w:t>
+      </w:r>
+      <w:proofErr w:type="gramStart"/>
+      <w:r>
+        <w:rPr>
+          <w:lang w:val="en-IN"/>
+        </w:rPr>
+        <w:t>service, that</w:t>
+      </w:r>
+      <w:proofErr w:type="gramEnd"/>
+      <w:r>
+        <w:rPr>
+          <w:lang w:val="en-IN"/>
+        </w:rPr>
+        <w:t xml:space="preserve"> we have called</w:t>
       </w:r>
       <w:r>
         <w:rPr>
@@ -259,7 +439,35 @@
         <w:rPr>
           <w:lang w:val="en-IN"/>
         </w:rPr>
-        <w:t xml:space="preserve">: This type of communication uses JSON using REST. It uses Rest Template, FeignClient, WebClient can be used for synchronous communication between 2 microservices. </w:t>
+        <w:t>: This type of communication use</w:t>
+      </w:r>
+      <w:r>
+        <w:rPr>
+          <w:lang w:val="en-IN"/>
+        </w:rPr>
+        <w:t xml:space="preserve">s JSON using REST. </w:t>
+      </w:r>
+      <w:proofErr w:type="spellStart"/>
+      <w:r>
+        <w:rPr>
+          <w:i/>
+          <w:iCs/>
+          <w:lang w:val="en-IN"/>
+        </w:rPr>
+        <w:t>RestClient</w:t>
+      </w:r>
+      <w:proofErr w:type="spellEnd"/>
+      <w:r>
+        <w:rPr>
+          <w:lang w:val="en-IN"/>
+        </w:rPr>
+        <w:t xml:space="preserve"> </w:t>
+      </w:r>
+      <w:r>
+        <w:rPr>
+          <w:lang w:val="en-IN"/>
+        </w:rPr>
+        <w:t xml:space="preserve">can be used for synchronous communication between 2 microservices. </w:t>
       </w:r>
     </w:p>
     <w:p>
@@ -285,7 +493,35 @@
         <w:rPr>
           <w:lang w:val="en-IN"/>
         </w:rPr>
-        <w:t>: In this type of communication, the client does not wait for response, instead it just sends the message to the message broker. Kafka, RabbitMQ can be used for asynchronous communication across microservices to achieve eventual consistency.</w:t>
+        <w:t xml:space="preserve">: In this type of communication, the client does not wait for </w:t>
+      </w:r>
+      <w:proofErr w:type="gramStart"/>
+      <w:r>
+        <w:rPr>
+          <w:lang w:val="en-IN"/>
+        </w:rPr>
+        <w:t>response,</w:t>
+      </w:r>
+      <w:proofErr w:type="gramEnd"/>
+      <w:r>
+        <w:rPr>
+          <w:lang w:val="en-IN"/>
+        </w:rPr>
+        <w:t xml:space="preserve"> instead it just sends the message to the message broker. Kafka, </w:t>
+      </w:r>
+      <w:proofErr w:type="spellStart"/>
+      <w:r>
+        <w:rPr>
+          <w:lang w:val="en-IN"/>
+        </w:rPr>
+        <w:t>RabbitMQ</w:t>
+      </w:r>
+      <w:proofErr w:type="spellEnd"/>
+      <w:r>
+        <w:rPr>
+          <w:lang w:val="en-IN"/>
+        </w:rPr>
+        <w:t xml:space="preserve"> can be used for asynchronous communication across microservices to achieve eventual consistency.</w:t>
       </w:r>
     </w:p>
     <w:p>
@@ -299,6 +535,8 @@
           <w:lang w:val="en-IN"/>
         </w:rPr>
       </w:pPr>
+      <w:proofErr w:type="spellStart"/>
+      <w:proofErr w:type="gramStart"/>
       <w:r>
         <w:rPr>
           <w:b/>
@@ -307,11 +545,59 @@
         </w:rPr>
         <w:t>gRPC</w:t>
       </w:r>
-      <w:r>
-        <w:rPr>
-          <w:lang w:val="en-IN"/>
-        </w:rPr>
-        <w:t>: It can be used in case microservices needs high performance low latency communication. gRPC supports both Synchronous and Asynchronous way of communication. It internally uses binary data. It is faster than REST. gRPC has gained more popularity in recent times.</w:t>
+      <w:proofErr w:type="spellEnd"/>
+      <w:proofErr w:type="gramEnd"/>
+      <w:r>
+        <w:rPr>
+          <w:lang w:val="en-IN"/>
+        </w:rPr>
+        <w:t xml:space="preserve">: It can be used in case microservices needs high performance low latency communication. </w:t>
+      </w:r>
+      <w:proofErr w:type="spellStart"/>
+      <w:proofErr w:type="gramStart"/>
+      <w:r>
+        <w:rPr>
+          <w:lang w:val="en-IN"/>
+        </w:rPr>
+        <w:t>gRPC</w:t>
+      </w:r>
+      <w:proofErr w:type="spellEnd"/>
+      <w:proofErr w:type="gramEnd"/>
+      <w:r>
+        <w:rPr>
+          <w:lang w:val="en-IN"/>
+        </w:rPr>
+        <w:t xml:space="preserve"> supports both Synchronous and Asynchronous way of communication. It internally uses </w:t>
+      </w:r>
+      <w:proofErr w:type="gramStart"/>
+      <w:r>
+        <w:rPr>
+          <w:lang w:val="en-IN"/>
+        </w:rPr>
+        <w:t>binary</w:t>
+      </w:r>
+      <w:proofErr w:type="gramEnd"/>
+      <w:r>
+        <w:rPr>
+          <w:lang w:val="en-IN"/>
+        </w:rPr>
+        <w:t xml:space="preserve"> data. It is faster than REST. </w:t>
+      </w:r>
+      <w:proofErr w:type="spellStart"/>
+      <w:proofErr w:type="gramStart"/>
+      <w:r>
+        <w:rPr>
+          <w:lang w:val="en-IN"/>
+        </w:rPr>
+        <w:t>gRPC</w:t>
+      </w:r>
+      <w:proofErr w:type="spellEnd"/>
+      <w:proofErr w:type="gramEnd"/>
+      <w:r>
+        <w:rPr>
+          <w:lang w:val="en-IN"/>
+        </w:rPr>
+        <w:t xml:space="preserve"> has gained more popularity in recent times.</w:t>
       </w:r>
     </w:p>
     <w:p>
@@ -334,7 +620,25 @@
           <w:bCs/>
           <w:lang w:val="en-IN"/>
         </w:rPr>
-        <w:t>When should we use gRPC and when should we use REST?</w:t>
+        <w:t xml:space="preserve">When should we use </w:t>
+      </w:r>
+      <w:proofErr w:type="spellStart"/>
+      <w:r>
+        <w:rPr>
+          <w:b/>
+          <w:bCs/>
+          <w:lang w:val="en-IN"/>
+        </w:rPr>
+        <w:t>gRPC</w:t>
+      </w:r>
+      <w:proofErr w:type="spellEnd"/>
+      <w:r>
+        <w:rPr>
+          <w:b/>
+          <w:bCs/>
+          <w:lang w:val="en-IN"/>
+        </w:rPr>
+        <w:t xml:space="preserve"> and when should we use REST?</w:t>
       </w:r>
     </w:p>
     <w:p>
@@ -349,7 +653,21 @@
         <w:rPr>
           <w:lang w:val="en-IN"/>
         </w:rPr>
-        <w:t>If we want to connect with browsers or want to create public API, then we should REST. For Micro-Service to Micro-Service communication we should use gRPC.</w:t>
+        <w:t xml:space="preserve">If we want to connect with browsers or want to create public API, then we should REST. For Micro-Service to Micro-Service communication we should use </w:t>
+      </w:r>
+      <w:proofErr w:type="spellStart"/>
+      <w:r>
+        <w:rPr>
+          <w:lang w:val="en-IN"/>
+        </w:rPr>
+        <w:t>gRPC</w:t>
+      </w:r>
+      <w:proofErr w:type="spellEnd"/>
+      <w:r>
+        <w:rPr>
+          <w:lang w:val="en-IN"/>
+        </w:rPr>
+        <w:t>.</w:t>
       </w:r>
     </w:p>
     <w:p>
@@ -641,7 +959,21 @@
         <w:rPr>
           <w:lang w:val="en-IN"/>
         </w:rPr>
-        <w:t>It provides alternative behavior when primary operation fails.</w:t>
+        <w:t xml:space="preserve">It provides alternative </w:t>
+      </w:r>
+      <w:proofErr w:type="spellStart"/>
+      <w:r>
+        <w:rPr>
+          <w:lang w:val="en-IN"/>
+        </w:rPr>
+        <w:t>behavior</w:t>
+      </w:r>
+      <w:proofErr w:type="spellEnd"/>
+      <w:r>
+        <w:rPr>
+          <w:lang w:val="en-IN"/>
+        </w:rPr>
+        <w:t xml:space="preserve"> when primary operation fails.</w:t>
       </w:r>
     </w:p>
     <w:p>
@@ -662,7 +994,16 @@
           <w:bCs/>
           <w:lang w:val="en-IN"/>
         </w:rPr>
-        <w:t>Resilience in Spring boot</w:t>
+        <w:t xml:space="preserve">Resilience in Spring </w:t>
+      </w:r>
+      <w:proofErr w:type="gramStart"/>
+      <w:r>
+        <w:rPr>
+          <w:b/>
+          <w:bCs/>
+          <w:lang w:val="en-IN"/>
+        </w:rPr>
+        <w:t>boot</w:t>
       </w:r>
       <w:r>
         <w:rPr>
@@ -670,6 +1011,7 @@
         </w:rPr>
         <w:t xml:space="preserve"> :</w:t>
       </w:r>
+      <w:proofErr w:type="gramEnd"/>
       <w:r>
         <w:rPr>
           <w:lang w:val="en-IN"/>
@@ -772,7 +1114,6 @@
         <w:rPr>
           <w:lang w:val="en-IN"/>
         </w:rPr>
-        <w:lastRenderedPageBreak/>
         <w:t>API Gateway is single entry point of an application that handles requests by routing them to appropriate backend service and also provides cross cutting concerns like monitoring, logging and security</w:t>
       </w:r>
       <w:r>
@@ -817,6 +1158,7 @@
           <w:b/>
           <w:lang w:val="en-IN"/>
         </w:rPr>
+        <w:lastRenderedPageBreak/>
         <w:t>What is Service Discovery?</w:t>
       </w:r>
       <w:r>
@@ -892,14 +1234,65 @@
           <w:b/>
           <w:lang w:val="en-IN"/>
         </w:rPr>
-        <w:t>What is Circuit Breaker.</w:t>
-      </w:r>
+        <w:t xml:space="preserve">What is Circuit </w:t>
+      </w:r>
+      <w:proofErr w:type="gramStart"/>
+      <w:r>
+        <w:rPr>
+          <w:b/>
+          <w:lang w:val="en-IN"/>
+        </w:rPr>
+        <w:t>Breaker.</w:t>
+      </w:r>
+      <w:proofErr w:type="gramEnd"/>
       <w:r>
         <w:rPr>
           <w:lang w:val="en-IN"/>
         </w:rPr>
         <w:br/>
-        <w:t xml:space="preserve">Suppose a Microservice ‘A’ is internally calling another Microservice ‘B’ and ‘B’ has some fault. Hence we will stop calling the faulty Microservice ‘B’. </w:t>
+        <w:t xml:space="preserve">Suppose a </w:t>
+      </w:r>
+      <w:proofErr w:type="spellStart"/>
+      <w:r>
+        <w:rPr>
+          <w:lang w:val="en-IN"/>
+        </w:rPr>
+        <w:t>Microservice</w:t>
+      </w:r>
+      <w:proofErr w:type="spellEnd"/>
+      <w:r>
+        <w:rPr>
+          <w:lang w:val="en-IN"/>
+        </w:rPr>
+        <w:t xml:space="preserve"> ‘A’ is internally calling another </w:t>
+      </w:r>
+      <w:proofErr w:type="spellStart"/>
+      <w:r>
+        <w:rPr>
+          <w:lang w:val="en-IN"/>
+        </w:rPr>
+        <w:t>Microservice</w:t>
+      </w:r>
+      <w:proofErr w:type="spellEnd"/>
+      <w:r>
+        <w:rPr>
+          <w:lang w:val="en-IN"/>
+        </w:rPr>
+        <w:t xml:space="preserve"> ‘B’ and ‘B’ has some fault. Hence we will stop calling the faulty </w:t>
+      </w:r>
+      <w:proofErr w:type="spellStart"/>
+      <w:r>
+        <w:rPr>
+          <w:lang w:val="en-IN"/>
+        </w:rPr>
+        <w:t>Microservice</w:t>
+      </w:r>
+      <w:proofErr w:type="spellEnd"/>
+      <w:r>
+        <w:rPr>
+          <w:lang w:val="en-IN"/>
+        </w:rPr>
+        <w:t xml:space="preserve"> ‘B’. </w:t>
       </w:r>
       <w:r>
         <w:rPr>
@@ -912,20 +1305,48 @@
         <w:rPr>
           <w:lang w:val="en-IN"/>
         </w:rPr>
-        <w:t xml:space="preserve">We can achieve this functionality with the help of annotation @CircuitBreaker </w:t>
-      </w:r>
-    </w:p>
-    <w:p>
-      <w:pPr>
-        <w:rPr>
-          <w:lang w:val="en-IN"/>
-        </w:rPr>
-      </w:pPr>
-      <w:r>
-        <w:rPr>
-          <w:lang w:val="en-IN"/>
-        </w:rPr>
-        <w:t xml:space="preserve">Moreover, there are generally three states of a Circuit Breaker Pattern : </w:t>
+        <w:t>We can achieve this functionality with the help of annotation @</w:t>
+      </w:r>
+      <w:proofErr w:type="spellStart"/>
+      <w:r>
+        <w:rPr>
+          <w:lang w:val="en-IN"/>
+        </w:rPr>
+        <w:t>CircuitBreaker</w:t>
+      </w:r>
+      <w:proofErr w:type="spellEnd"/>
+      <w:r>
+        <w:rPr>
+          <w:lang w:val="en-IN"/>
+        </w:rPr>
+        <w:t xml:space="preserve"> </w:t>
+      </w:r>
+    </w:p>
+    <w:p>
+      <w:pPr>
+        <w:rPr>
+          <w:lang w:val="en-IN"/>
+        </w:rPr>
+      </w:pPr>
+      <w:r>
+        <w:rPr>
+          <w:lang w:val="en-IN"/>
+        </w:rPr>
+        <w:t xml:space="preserve">Moreover, there are generally three states of a Circuit Breaker </w:t>
+      </w:r>
+      <w:proofErr w:type="gramStart"/>
+      <w:r>
+        <w:rPr>
+          <w:lang w:val="en-IN"/>
+        </w:rPr>
+        <w:t>Pattern :</w:t>
+      </w:r>
+      <w:proofErr w:type="gramEnd"/>
+      <w:r>
+        <w:rPr>
+          <w:lang w:val="en-IN"/>
+        </w:rPr>
+        <w:t xml:space="preserve"> </w:t>
       </w:r>
     </w:p>
     <w:p>
@@ -952,11 +1373,19 @@
         </w:rPr>
         <w:t xml:space="preserve">: In this state, </w:t>
       </w:r>
-      <w:r>
-        <w:rPr>
-          <w:lang w:val="en-IN"/>
-        </w:rPr>
-        <w:t xml:space="preserve">The circuit breaker allows microservices to communicate as usual and monitor the number of failures occurring within the defined time period. If the failure count exceeds the specified threshold value, the circuit breaker will move to the Open state. </w:t>
+      <w:proofErr w:type="gramStart"/>
+      <w:r>
+        <w:rPr>
+          <w:lang w:val="en-IN"/>
+        </w:rPr>
+        <w:t>The</w:t>
+      </w:r>
+      <w:proofErr w:type="gramEnd"/>
+      <w:r>
+        <w:rPr>
+          <w:lang w:val="en-IN"/>
+        </w:rPr>
+        <w:t xml:space="preserve"> circuit breaker allows microservices to communicate as usual and monitor the number of failures occurring within the defined time period. If the failure count exceeds the specified threshold value, the circuit breaker will move to the Open state. </w:t>
       </w:r>
     </w:p>
     <w:p>
@@ -1085,7 +1514,23 @@
           <w:b/>
           <w:lang w:val="en-IN"/>
         </w:rPr>
-        <w:t>What is retry mechanism?</w:t>
+        <w:t xml:space="preserve">What is </w:t>
+      </w:r>
+      <w:proofErr w:type="gramStart"/>
+      <w:r>
+        <w:rPr>
+          <w:b/>
+          <w:lang w:val="en-IN"/>
+        </w:rPr>
+        <w:t>retry</w:t>
+      </w:r>
+      <w:proofErr w:type="gramEnd"/>
+      <w:r>
+        <w:rPr>
+          <w:b/>
+          <w:lang w:val="en-IN"/>
+        </w:rPr>
+        <w:t xml:space="preserve"> mechanism?</w:t>
       </w:r>
     </w:p>
     <w:p>
@@ -1165,7 +1610,51 @@
         <w:rPr>
           <w:lang w:val="en-IN"/>
         </w:rPr>
-        <w:t>In a Spring Boot + Microservice application, we are waiting for response from another microservice, If we did't get it within 10 seconds then we should give a error message: "request timed out. Please try later"</w:t>
+        <w:t xml:space="preserve">In a Spring Boot + </w:t>
+      </w:r>
+      <w:proofErr w:type="spellStart"/>
+      <w:r>
+        <w:rPr>
+          <w:lang w:val="en-IN"/>
+        </w:rPr>
+        <w:t>Microservice</w:t>
+      </w:r>
+      <w:proofErr w:type="spellEnd"/>
+      <w:r>
+        <w:rPr>
+          <w:lang w:val="en-IN"/>
+        </w:rPr>
+        <w:t xml:space="preserve"> application, we are waiting for response from another </w:t>
+      </w:r>
+      <w:proofErr w:type="spellStart"/>
+      <w:proofErr w:type="gramStart"/>
+      <w:r>
+        <w:rPr>
+          <w:lang w:val="en-IN"/>
+        </w:rPr>
+        <w:t>microservice</w:t>
+      </w:r>
+      <w:proofErr w:type="spellEnd"/>
+      <w:proofErr w:type="gramEnd"/>
+      <w:r>
+        <w:rPr>
+          <w:lang w:val="en-IN"/>
+        </w:rPr>
+        <w:t xml:space="preserve">, If we </w:t>
+      </w:r>
+      <w:proofErr w:type="spellStart"/>
+      <w:r>
+        <w:rPr>
+          <w:lang w:val="en-IN"/>
+        </w:rPr>
+        <w:t>did't</w:t>
+      </w:r>
+      <w:proofErr w:type="spellEnd"/>
+      <w:r>
+        <w:rPr>
+          <w:lang w:val="en-IN"/>
+        </w:rPr>
+        <w:t xml:space="preserve"> get it within 10 seconds then we should give a error message: "request timed out. Please try later"</w:t>
       </w:r>
       <w:r>
         <w:rPr>
@@ -1186,7 +1675,6 @@
         <w:rPr>
           <w:lang w:val="en-IN"/>
         </w:rPr>
-        <w:lastRenderedPageBreak/>
         <w:br/>
         <w:t>There are 2 ways we can implement the above scenario:</w:t>
       </w:r>
@@ -1206,7 +1694,49 @@
         <w:rPr>
           <w:lang w:val="en-IN"/>
         </w:rPr>
-        <w:t>Apache HttpClient + RequestConfig (RestTemplate)</w:t>
+        <w:t xml:space="preserve">Apache </w:t>
+      </w:r>
+      <w:proofErr w:type="spellStart"/>
+      <w:r>
+        <w:rPr>
+          <w:lang w:val="en-IN"/>
+        </w:rPr>
+        <w:t>HttpClient</w:t>
+      </w:r>
+      <w:proofErr w:type="spellEnd"/>
+      <w:r>
+        <w:rPr>
+          <w:lang w:val="en-IN"/>
+        </w:rPr>
+        <w:t xml:space="preserve"> + </w:t>
+      </w:r>
+      <w:proofErr w:type="spellStart"/>
+      <w:r>
+        <w:rPr>
+          <w:lang w:val="en-IN"/>
+        </w:rPr>
+        <w:t>RequestConfig</w:t>
+      </w:r>
+      <w:proofErr w:type="spellEnd"/>
+      <w:r>
+        <w:rPr>
+          <w:lang w:val="en-IN"/>
+        </w:rPr>
+        <w:t xml:space="preserve"> (</w:t>
+      </w:r>
+      <w:proofErr w:type="spellStart"/>
+      <w:r>
+        <w:rPr>
+          <w:lang w:val="en-IN"/>
+        </w:rPr>
+        <w:t>RestTemplate</w:t>
+      </w:r>
+      <w:proofErr w:type="spellEnd"/>
+      <w:r>
+        <w:rPr>
+          <w:lang w:val="en-IN"/>
+        </w:rPr>
+        <w:t>)</w:t>
       </w:r>
     </w:p>
     <w:p>
@@ -1224,7 +1754,64 @@
         <w:rPr>
           <w:lang w:val="en-IN"/>
         </w:rPr>
-        <w:t>Use Resilience4J, It provides @TimeLimiter annotation. It should be annotated to the method which calls another microservice. This annotation should be used in conjuction with @CircuitBreaker.</w:t>
+        <w:lastRenderedPageBreak/>
+        <w:t>Use Resilience4J, It provides @</w:t>
+      </w:r>
+      <w:proofErr w:type="spellStart"/>
+      <w:r>
+        <w:rPr>
+          <w:lang w:val="en-IN"/>
+        </w:rPr>
+        <w:t>TimeLimiter</w:t>
+      </w:r>
+      <w:proofErr w:type="spellEnd"/>
+      <w:r>
+        <w:rPr>
+          <w:lang w:val="en-IN"/>
+        </w:rPr>
+        <w:t xml:space="preserve"> annotation. It should be annotated to the method which calls another </w:t>
+      </w:r>
+      <w:proofErr w:type="spellStart"/>
+      <w:r>
+        <w:rPr>
+          <w:lang w:val="en-IN"/>
+        </w:rPr>
+        <w:t>microservice</w:t>
+      </w:r>
+      <w:proofErr w:type="spellEnd"/>
+      <w:r>
+        <w:rPr>
+          <w:lang w:val="en-IN"/>
+        </w:rPr>
+        <w:t xml:space="preserve">. This annotation should be used in </w:t>
+      </w:r>
+      <w:proofErr w:type="spellStart"/>
+      <w:r>
+        <w:rPr>
+          <w:lang w:val="en-IN"/>
+        </w:rPr>
+        <w:t>conjuction</w:t>
+      </w:r>
+      <w:proofErr w:type="spellEnd"/>
+      <w:r>
+        <w:rPr>
+          <w:lang w:val="en-IN"/>
+        </w:rPr>
+        <w:t xml:space="preserve"> with @</w:t>
+      </w:r>
+      <w:proofErr w:type="spellStart"/>
+      <w:r>
+        <w:rPr>
+          <w:lang w:val="en-IN"/>
+        </w:rPr>
+        <w:t>CircuitBreaker</w:t>
+      </w:r>
+      <w:proofErr w:type="spellEnd"/>
+      <w:r>
+        <w:rPr>
+          <w:lang w:val="en-IN"/>
+        </w:rPr>
+        <w:t>.</w:t>
       </w:r>
     </w:p>
     <w:p>
@@ -1257,7 +1844,53 @@
           <w:szCs w:val="18"/>
           <w:lang w:val="en-IN"/>
         </w:rPr>
-        <w:t>public RestTemplate restTemplate() {</w:t>
+        <w:t xml:space="preserve">public </w:t>
+      </w:r>
+      <w:proofErr w:type="spellStart"/>
+      <w:r>
+        <w:rPr>
+          <w:sz w:val="18"/>
+          <w:szCs w:val="18"/>
+          <w:lang w:val="en-IN"/>
+        </w:rPr>
+        <w:t>RestTemplate</w:t>
+      </w:r>
+      <w:proofErr w:type="spellEnd"/>
+      <w:r>
+        <w:rPr>
+          <w:sz w:val="18"/>
+          <w:szCs w:val="18"/>
+          <w:lang w:val="en-IN"/>
+        </w:rPr>
+        <w:t xml:space="preserve"> </w:t>
+      </w:r>
+      <w:proofErr w:type="spellStart"/>
+      <w:proofErr w:type="gramStart"/>
+      <w:r>
+        <w:rPr>
+          <w:sz w:val="18"/>
+          <w:szCs w:val="18"/>
+          <w:lang w:val="en-IN"/>
+        </w:rPr>
+        <w:t>restTemplate</w:t>
+      </w:r>
+      <w:proofErr w:type="spellEnd"/>
+      <w:r>
+        <w:rPr>
+          <w:sz w:val="18"/>
+          <w:szCs w:val="18"/>
+          <w:lang w:val="en-IN"/>
+        </w:rPr>
+        <w:t>(</w:t>
+      </w:r>
+      <w:proofErr w:type="gramEnd"/>
+      <w:r>
+        <w:rPr>
+          <w:sz w:val="18"/>
+          <w:szCs w:val="18"/>
+          <w:lang w:val="en-IN"/>
+        </w:rPr>
+        <w:t>) {</w:t>
       </w:r>
     </w:p>
     <w:p>
@@ -1284,14 +1917,52 @@
         </w:rPr>
         <w:br/>
       </w:r>
-      <w:r>
-        <w:rPr>
-          <w:sz w:val="18"/>
-          <w:szCs w:val="18"/>
-          <w:lang w:val="en-IN"/>
-        </w:rPr>
-        <w:t>RequestConfig requestConfig = RequestConfig</w:t>
-      </w:r>
+      <w:proofErr w:type="spellStart"/>
+      <w:r>
+        <w:rPr>
+          <w:sz w:val="18"/>
+          <w:szCs w:val="18"/>
+          <w:lang w:val="en-IN"/>
+        </w:rPr>
+        <w:t>RequestConfig</w:t>
+      </w:r>
+      <w:proofErr w:type="spellEnd"/>
+      <w:r>
+        <w:rPr>
+          <w:sz w:val="18"/>
+          <w:szCs w:val="18"/>
+          <w:lang w:val="en-IN"/>
+        </w:rPr>
+        <w:t xml:space="preserve"> </w:t>
+      </w:r>
+      <w:proofErr w:type="spellStart"/>
+      <w:r>
+        <w:rPr>
+          <w:sz w:val="18"/>
+          <w:szCs w:val="18"/>
+          <w:lang w:val="en-IN"/>
+        </w:rPr>
+        <w:t>requestConfig</w:t>
+      </w:r>
+      <w:proofErr w:type="spellEnd"/>
+      <w:r>
+        <w:rPr>
+          <w:sz w:val="18"/>
+          <w:szCs w:val="18"/>
+          <w:lang w:val="en-IN"/>
+        </w:rPr>
+        <w:t xml:space="preserve"> = </w:t>
+      </w:r>
+      <w:proofErr w:type="spellStart"/>
+      <w:r>
+        <w:rPr>
+          <w:sz w:val="18"/>
+          <w:szCs w:val="18"/>
+          <w:lang w:val="en-IN"/>
+        </w:rPr>
+        <w:t>RequestConfig</w:t>
+      </w:r>
+      <w:proofErr w:type="spellEnd"/>
       <w:r>
         <w:rPr>
           <w:sz w:val="18"/>
@@ -1339,7 +2010,25 @@
           <w:szCs w:val="18"/>
           <w:lang w:val="en-IN"/>
         </w:rPr>
-        <w:t>.custom()</w:t>
+        <w:t>.</w:t>
+      </w:r>
+      <w:proofErr w:type="gramStart"/>
+      <w:r>
+        <w:rPr>
+          <w:sz w:val="18"/>
+          <w:szCs w:val="18"/>
+          <w:lang w:val="en-IN"/>
+        </w:rPr>
+        <w:t>custom(</w:t>
+      </w:r>
+      <w:proofErr w:type="gramEnd"/>
+      <w:r>
+        <w:rPr>
+          <w:sz w:val="18"/>
+          <w:szCs w:val="18"/>
+          <w:lang w:val="en-IN"/>
+        </w:rPr>
+        <w:t>)</w:t>
       </w:r>
       <w:r>
         <w:rPr>
@@ -1388,7 +2077,25 @@
           <w:szCs w:val="18"/>
           <w:lang w:val="en-IN"/>
         </w:rPr>
-        <w:t>.setConnectTimeout(5000)     // time to establish connection</w:t>
+        <w:t>.</w:t>
+      </w:r>
+      <w:proofErr w:type="spellStart"/>
+      <w:r>
+        <w:rPr>
+          <w:sz w:val="18"/>
+          <w:szCs w:val="18"/>
+          <w:lang w:val="en-IN"/>
+        </w:rPr>
+        <w:t>setConnectTimeout</w:t>
+      </w:r>
+      <w:proofErr w:type="spellEnd"/>
+      <w:r>
+        <w:rPr>
+          <w:sz w:val="18"/>
+          <w:szCs w:val="18"/>
+          <w:lang w:val="en-IN"/>
+        </w:rPr>
+        <w:t>(5000)     // time to establish connection</w:t>
       </w:r>
       <w:r>
         <w:rPr>
@@ -1437,7 +2144,25 @@
           <w:szCs w:val="18"/>
           <w:lang w:val="en-IN"/>
         </w:rPr>
-        <w:t>.setConnectionRequestTimeout(5000) // time to wait for a connection from pool</w:t>
+        <w:t>.</w:t>
+      </w:r>
+      <w:proofErr w:type="spellStart"/>
+      <w:r>
+        <w:rPr>
+          <w:sz w:val="18"/>
+          <w:szCs w:val="18"/>
+          <w:lang w:val="en-IN"/>
+        </w:rPr>
+        <w:t>setConnectionRequestTimeout</w:t>
+      </w:r>
+      <w:proofErr w:type="spellEnd"/>
+      <w:r>
+        <w:rPr>
+          <w:sz w:val="18"/>
+          <w:szCs w:val="18"/>
+          <w:lang w:val="en-IN"/>
+        </w:rPr>
+        <w:t>(5000) // time to wait for a connection from pool</w:t>
       </w:r>
       <w:r>
         <w:rPr>
@@ -1486,7 +2211,25 @@
           <w:szCs w:val="18"/>
           <w:lang w:val="en-IN"/>
         </w:rPr>
-        <w:t>.setSocketTimeout(5000)      // time waiting for data (read timeout)</w:t>
+        <w:t>.</w:t>
+      </w:r>
+      <w:proofErr w:type="spellStart"/>
+      <w:r>
+        <w:rPr>
+          <w:sz w:val="18"/>
+          <w:szCs w:val="18"/>
+          <w:lang w:val="en-IN"/>
+        </w:rPr>
+        <w:t>setSocketTimeout</w:t>
+      </w:r>
+      <w:proofErr w:type="spellEnd"/>
+      <w:r>
+        <w:rPr>
+          <w:sz w:val="18"/>
+          <w:szCs w:val="18"/>
+          <w:lang w:val="en-IN"/>
+        </w:rPr>
+        <w:t>(5000)      // time waiting for data (read timeout)</w:t>
       </w:r>
       <w:r>
         <w:rPr>
@@ -1552,59 +2295,63 @@
           <w:szCs w:val="18"/>
           <w:lang w:val="en-IN"/>
         </w:rPr>
-        <w:t xml:space="preserve">    // Step 2: Build HttpClient with that config</w:t>
-      </w:r>
-    </w:p>
-    <w:p>
-      <w:pPr>
-        <w:rPr>
-          <w:sz w:val="18"/>
-          <w:szCs w:val="18"/>
-          <w:lang w:val="en-IN"/>
-        </w:rPr>
-      </w:pPr>
-      <w:r>
-        <w:rPr>
-          <w:sz w:val="18"/>
-          <w:szCs w:val="18"/>
-          <w:lang w:val="en-IN"/>
-        </w:rPr>
-        <w:t xml:space="preserve">    CloseableHttpClient httpClient = HttpClients.custom().setDefaultRequestConfig(requestConfig).build();</w:t>
-      </w:r>
-    </w:p>
-    <w:p>
-      <w:pPr>
-        <w:rPr>
-          <w:sz w:val="18"/>
-          <w:szCs w:val="18"/>
-          <w:lang w:val="en-IN"/>
-        </w:rPr>
-      </w:pPr>
-      <w:r>
-        <w:rPr>
-          <w:sz w:val="18"/>
-          <w:szCs w:val="18"/>
-          <w:lang w:val="en-IN"/>
-        </w:rPr>
-        <w:t xml:space="preserve">    // Step 3: Create RestTemplate with HttpComponentsClientHttpRequestFactory</w:t>
-      </w:r>
-    </w:p>
-    <w:p>
-      <w:pPr>
-        <w:rPr>
-          <w:sz w:val="18"/>
-          <w:szCs w:val="18"/>
-          <w:lang w:val="en-IN"/>
-        </w:rPr>
-      </w:pPr>
-      <w:r>
-        <w:rPr>
-          <w:sz w:val="18"/>
-          <w:szCs w:val="18"/>
-          <w:lang w:val="en-IN"/>
-        </w:rPr>
-        <w:t xml:space="preserve">    HttpComponentsClientHttpRequestFactory factory =</w:t>
-      </w:r>
+        <w:t xml:space="preserve">    // Step 2: Build </w:t>
+      </w:r>
+      <w:proofErr w:type="spellStart"/>
+      <w:r>
+        <w:rPr>
+          <w:sz w:val="18"/>
+          <w:szCs w:val="18"/>
+          <w:lang w:val="en-IN"/>
+        </w:rPr>
+        <w:t>HttpClient</w:t>
+      </w:r>
+      <w:proofErr w:type="spellEnd"/>
+      <w:r>
+        <w:rPr>
+          <w:sz w:val="18"/>
+          <w:szCs w:val="18"/>
+          <w:lang w:val="en-IN"/>
+        </w:rPr>
+        <w:t xml:space="preserve"> with that </w:t>
+      </w:r>
+      <w:proofErr w:type="spellStart"/>
+      <w:r>
+        <w:rPr>
+          <w:sz w:val="18"/>
+          <w:szCs w:val="18"/>
+          <w:lang w:val="en-IN"/>
+        </w:rPr>
+        <w:t>config</w:t>
+      </w:r>
+      <w:proofErr w:type="spellEnd"/>
+    </w:p>
+    <w:p>
+      <w:pPr>
+        <w:rPr>
+          <w:sz w:val="18"/>
+          <w:szCs w:val="18"/>
+          <w:lang w:val="en-IN"/>
+        </w:rPr>
+      </w:pPr>
+      <w:r>
+        <w:rPr>
+          <w:sz w:val="18"/>
+          <w:szCs w:val="18"/>
+          <w:lang w:val="en-IN"/>
+        </w:rPr>
+        <w:t xml:space="preserve">    </w:t>
+      </w:r>
+      <w:proofErr w:type="spellStart"/>
+      <w:r>
+        <w:rPr>
+          <w:sz w:val="18"/>
+          <w:szCs w:val="18"/>
+          <w:lang w:val="en-IN"/>
+        </w:rPr>
+        <w:t>CloseableHttpClient</w:t>
+      </w:r>
+      <w:proofErr w:type="spellEnd"/>
       <w:r>
         <w:rPr>
           <w:sz w:val="18"/>
@@ -1613,13 +2360,175 @@
         </w:rPr>
         <w:t xml:space="preserve"> </w:t>
       </w:r>
-      <w:r>
-        <w:rPr>
-          <w:sz w:val="18"/>
-          <w:szCs w:val="18"/>
-          <w:lang w:val="en-IN"/>
-        </w:rPr>
-        <w:t>new HttpComponentsClientHttpRequestFactory(httpClient);</w:t>
+      <w:proofErr w:type="spellStart"/>
+      <w:r>
+        <w:rPr>
+          <w:sz w:val="18"/>
+          <w:szCs w:val="18"/>
+          <w:lang w:val="en-IN"/>
+        </w:rPr>
+        <w:t>httpClient</w:t>
+      </w:r>
+      <w:proofErr w:type="spellEnd"/>
+      <w:r>
+        <w:rPr>
+          <w:sz w:val="18"/>
+          <w:szCs w:val="18"/>
+          <w:lang w:val="en-IN"/>
+        </w:rPr>
+        <w:t xml:space="preserve"> = </w:t>
+      </w:r>
+      <w:proofErr w:type="gramStart"/>
+      <w:r>
+        <w:rPr>
+          <w:sz w:val="18"/>
+          <w:szCs w:val="18"/>
+          <w:lang w:val="en-IN"/>
+        </w:rPr>
+        <w:t>HttpClients.custom(</w:t>
+      </w:r>
+      <w:proofErr w:type="gramEnd"/>
+      <w:r>
+        <w:rPr>
+          <w:sz w:val="18"/>
+          <w:szCs w:val="18"/>
+          <w:lang w:val="en-IN"/>
+        </w:rPr>
+        <w:t>).setDefaultRequestConfig(requestConfig).build();</w:t>
+      </w:r>
+    </w:p>
+    <w:p>
+      <w:pPr>
+        <w:rPr>
+          <w:sz w:val="18"/>
+          <w:szCs w:val="18"/>
+          <w:lang w:val="en-IN"/>
+        </w:rPr>
+      </w:pPr>
+      <w:r>
+        <w:rPr>
+          <w:sz w:val="18"/>
+          <w:szCs w:val="18"/>
+          <w:lang w:val="en-IN"/>
+        </w:rPr>
+        <w:t xml:space="preserve">    // Step 3: Create </w:t>
+      </w:r>
+      <w:proofErr w:type="spellStart"/>
+      <w:r>
+        <w:rPr>
+          <w:sz w:val="18"/>
+          <w:szCs w:val="18"/>
+          <w:lang w:val="en-IN"/>
+        </w:rPr>
+        <w:t>RestTemplate</w:t>
+      </w:r>
+      <w:proofErr w:type="spellEnd"/>
+      <w:r>
+        <w:rPr>
+          <w:sz w:val="18"/>
+          <w:szCs w:val="18"/>
+          <w:lang w:val="en-IN"/>
+        </w:rPr>
+        <w:t xml:space="preserve"> with </w:t>
+      </w:r>
+      <w:proofErr w:type="spellStart"/>
+      <w:r>
+        <w:rPr>
+          <w:sz w:val="18"/>
+          <w:szCs w:val="18"/>
+          <w:lang w:val="en-IN"/>
+        </w:rPr>
+        <w:t>HttpComponentsClientHttpRequestFactory</w:t>
+      </w:r>
+      <w:proofErr w:type="spellEnd"/>
+    </w:p>
+    <w:p>
+      <w:pPr>
+        <w:rPr>
+          <w:sz w:val="18"/>
+          <w:szCs w:val="18"/>
+          <w:lang w:val="en-IN"/>
+        </w:rPr>
+      </w:pPr>
+      <w:r>
+        <w:rPr>
+          <w:sz w:val="18"/>
+          <w:szCs w:val="18"/>
+          <w:lang w:val="en-IN"/>
+        </w:rPr>
+        <w:t xml:space="preserve">    </w:t>
+      </w:r>
+      <w:proofErr w:type="spellStart"/>
+      <w:r>
+        <w:rPr>
+          <w:sz w:val="18"/>
+          <w:szCs w:val="18"/>
+          <w:lang w:val="en-IN"/>
+        </w:rPr>
+        <w:t>HttpComponentsClientHttpRequestFactory</w:t>
+      </w:r>
+      <w:proofErr w:type="spellEnd"/>
+      <w:r>
+        <w:rPr>
+          <w:sz w:val="18"/>
+          <w:szCs w:val="18"/>
+          <w:lang w:val="en-IN"/>
+        </w:rPr>
+        <w:t xml:space="preserve"> factory =</w:t>
+      </w:r>
+      <w:r>
+        <w:rPr>
+          <w:sz w:val="18"/>
+          <w:szCs w:val="18"/>
+          <w:lang w:val="en-IN"/>
+        </w:rPr>
+        <w:t xml:space="preserve"> </w:t>
+      </w:r>
+      <w:r>
+        <w:rPr>
+          <w:sz w:val="18"/>
+          <w:szCs w:val="18"/>
+          <w:lang w:val="en-IN"/>
+        </w:rPr>
+        <w:t xml:space="preserve">new </w:t>
+      </w:r>
+      <w:proofErr w:type="spellStart"/>
+      <w:proofErr w:type="gramStart"/>
+      <w:r>
+        <w:rPr>
+          <w:sz w:val="18"/>
+          <w:szCs w:val="18"/>
+          <w:lang w:val="en-IN"/>
+        </w:rPr>
+        <w:t>HttpComponentsClientHttpRequestFactory</w:t>
+      </w:r>
+      <w:proofErr w:type="spellEnd"/>
+      <w:r>
+        <w:rPr>
+          <w:sz w:val="18"/>
+          <w:szCs w:val="18"/>
+          <w:lang w:val="en-IN"/>
+        </w:rPr>
+        <w:t>(</w:t>
+      </w:r>
+      <w:proofErr w:type="spellStart"/>
+      <w:proofErr w:type="gramEnd"/>
+      <w:r>
+        <w:rPr>
+          <w:sz w:val="18"/>
+          <w:szCs w:val="18"/>
+          <w:lang w:val="en-IN"/>
+        </w:rPr>
+        <w:t>httpClient</w:t>
+      </w:r>
+      <w:proofErr w:type="spellEnd"/>
+      <w:r>
+        <w:rPr>
+          <w:sz w:val="18"/>
+          <w:szCs w:val="18"/>
+          <w:lang w:val="en-IN"/>
+        </w:rPr>
+        <w:t>);</w:t>
       </w:r>
       <w:r>
         <w:rPr>
@@ -1636,7 +2545,25 @@
           <w:szCs w:val="18"/>
           <w:lang w:val="en-IN"/>
         </w:rPr>
-        <w:t>return new RestTemplate(factory);}</w:t>
+        <w:t xml:space="preserve">return new </w:t>
+      </w:r>
+      <w:proofErr w:type="spellStart"/>
+      <w:r>
+        <w:rPr>
+          <w:sz w:val="18"/>
+          <w:szCs w:val="18"/>
+          <w:lang w:val="en-IN"/>
+        </w:rPr>
+        <w:t>RestTemplate</w:t>
+      </w:r>
+      <w:proofErr w:type="spellEnd"/>
+      <w:r>
+        <w:rPr>
+          <w:sz w:val="18"/>
+          <w:szCs w:val="18"/>
+          <w:lang w:val="en-IN"/>
+        </w:rPr>
+        <w:t>(factory);}</w:t>
       </w:r>
     </w:p>
     <w:p>
@@ -1669,7 +2596,25 @@
           <w:szCs w:val="18"/>
           <w:lang w:val="en-IN"/>
         </w:rPr>
-        <w:t>public class StudentService {</w:t>
+        <w:t xml:space="preserve">public class </w:t>
+      </w:r>
+      <w:proofErr w:type="spellStart"/>
+      <w:r>
+        <w:rPr>
+          <w:sz w:val="18"/>
+          <w:szCs w:val="18"/>
+          <w:lang w:val="en-IN"/>
+        </w:rPr>
+        <w:t>StudentService</w:t>
+      </w:r>
+      <w:proofErr w:type="spellEnd"/>
+      <w:r>
+        <w:rPr>
+          <w:sz w:val="18"/>
+          <w:szCs w:val="18"/>
+          <w:lang w:val="en-IN"/>
+        </w:rPr>
+        <w:t xml:space="preserve"> {</w:t>
       </w:r>
       <w:r>
         <w:rPr>
@@ -1694,8 +2639,90 @@
           <w:szCs w:val="18"/>
           <w:lang w:val="en-IN"/>
         </w:rPr>
-        <w:t>private final RestTemplate restTemplate; // Bean bana kar inject karna</w:t>
-      </w:r>
+        <w:t xml:space="preserve">private final </w:t>
+      </w:r>
+      <w:proofErr w:type="spellStart"/>
+      <w:r>
+        <w:rPr>
+          <w:sz w:val="18"/>
+          <w:szCs w:val="18"/>
+          <w:lang w:val="en-IN"/>
+        </w:rPr>
+        <w:t>RestTemplate</w:t>
+      </w:r>
+      <w:proofErr w:type="spellEnd"/>
+      <w:r>
+        <w:rPr>
+          <w:sz w:val="18"/>
+          <w:szCs w:val="18"/>
+          <w:lang w:val="en-IN"/>
+        </w:rPr>
+        <w:t xml:space="preserve"> </w:t>
+      </w:r>
+      <w:proofErr w:type="spellStart"/>
+      <w:r>
+        <w:rPr>
+          <w:sz w:val="18"/>
+          <w:szCs w:val="18"/>
+          <w:lang w:val="en-IN"/>
+        </w:rPr>
+        <w:t>restTemplate</w:t>
+      </w:r>
+      <w:proofErr w:type="spellEnd"/>
+      <w:r>
+        <w:rPr>
+          <w:sz w:val="18"/>
+          <w:szCs w:val="18"/>
+          <w:lang w:val="en-IN"/>
+        </w:rPr>
+        <w:t xml:space="preserve">; // Bean </w:t>
+      </w:r>
+      <w:proofErr w:type="spellStart"/>
+      <w:r>
+        <w:rPr>
+          <w:sz w:val="18"/>
+          <w:szCs w:val="18"/>
+          <w:lang w:val="en-IN"/>
+        </w:rPr>
+        <w:t>bana</w:t>
+      </w:r>
+      <w:proofErr w:type="spellEnd"/>
+      <w:r>
+        <w:rPr>
+          <w:sz w:val="18"/>
+          <w:szCs w:val="18"/>
+          <w:lang w:val="en-IN"/>
+        </w:rPr>
+        <w:t xml:space="preserve"> </w:t>
+      </w:r>
+      <w:proofErr w:type="spellStart"/>
+      <w:r>
+        <w:rPr>
+          <w:sz w:val="18"/>
+          <w:szCs w:val="18"/>
+          <w:lang w:val="en-IN"/>
+        </w:rPr>
+        <w:t>kar</w:t>
+      </w:r>
+      <w:proofErr w:type="spellEnd"/>
+      <w:r>
+        <w:rPr>
+          <w:sz w:val="18"/>
+          <w:szCs w:val="18"/>
+          <w:lang w:val="en-IN"/>
+        </w:rPr>
+        <w:t xml:space="preserve"> inject </w:t>
+      </w:r>
+      <w:proofErr w:type="spellStart"/>
+      <w:r>
+        <w:rPr>
+          <w:sz w:val="18"/>
+          <w:szCs w:val="18"/>
+          <w:lang w:val="en-IN"/>
+        </w:rPr>
+        <w:t>karna</w:t>
+      </w:r>
+      <w:proofErr w:type="spellEnd"/>
       <w:r>
         <w:rPr>
           <w:sz w:val="18"/>
@@ -1719,7 +2746,61 @@
           <w:szCs w:val="18"/>
           <w:lang w:val="en-IN"/>
         </w:rPr>
-        <w:t>public StudentService(RestTemplate restTemplate) {</w:t>
+        <w:t xml:space="preserve">public </w:t>
+      </w:r>
+      <w:proofErr w:type="spellStart"/>
+      <w:r>
+        <w:rPr>
+          <w:sz w:val="18"/>
+          <w:szCs w:val="18"/>
+          <w:lang w:val="en-IN"/>
+        </w:rPr>
+        <w:t>StudentService</w:t>
+      </w:r>
+      <w:proofErr w:type="spellEnd"/>
+      <w:r>
+        <w:rPr>
+          <w:sz w:val="18"/>
+          <w:szCs w:val="18"/>
+          <w:lang w:val="en-IN"/>
+        </w:rPr>
+        <w:t>(</w:t>
+      </w:r>
+      <w:proofErr w:type="spellStart"/>
+      <w:r>
+        <w:rPr>
+          <w:sz w:val="18"/>
+          <w:szCs w:val="18"/>
+          <w:lang w:val="en-IN"/>
+        </w:rPr>
+        <w:t>RestTemplate</w:t>
+      </w:r>
+      <w:proofErr w:type="spellEnd"/>
+      <w:r>
+        <w:rPr>
+          <w:sz w:val="18"/>
+          <w:szCs w:val="18"/>
+          <w:lang w:val="en-IN"/>
+        </w:rPr>
+        <w:t xml:space="preserve"> </w:t>
+      </w:r>
+      <w:proofErr w:type="spellStart"/>
+      <w:r>
+        <w:rPr>
+          <w:sz w:val="18"/>
+          <w:szCs w:val="18"/>
+          <w:lang w:val="en-IN"/>
+        </w:rPr>
+        <w:t>restTemplate</w:t>
+      </w:r>
+      <w:proofErr w:type="spellEnd"/>
+      <w:r>
+        <w:rPr>
+          <w:sz w:val="18"/>
+          <w:szCs w:val="18"/>
+          <w:lang w:val="en-IN"/>
+        </w:rPr>
+        <w:t>) {</w:t>
       </w:r>
       <w:r>
         <w:rPr>
@@ -1746,13 +2827,41 @@
         </w:rPr>
         <w:tab/>
       </w:r>
-      <w:r>
-        <w:rPr>
-          <w:sz w:val="18"/>
-          <w:szCs w:val="18"/>
-          <w:lang w:val="en-IN"/>
-        </w:rPr>
-        <w:t>this.restTemplate = restTemplate;</w:t>
+      <w:proofErr w:type="spellStart"/>
+      <w:r>
+        <w:rPr>
+          <w:sz w:val="18"/>
+          <w:szCs w:val="18"/>
+          <w:lang w:val="en-IN"/>
+        </w:rPr>
+        <w:t>this.restTemplate</w:t>
+      </w:r>
+      <w:proofErr w:type="spellEnd"/>
+      <w:r>
+        <w:rPr>
+          <w:sz w:val="18"/>
+          <w:szCs w:val="18"/>
+          <w:lang w:val="en-IN"/>
+        </w:rPr>
+        <w:t xml:space="preserve"> = </w:t>
+      </w:r>
+      <w:proofErr w:type="spellStart"/>
+      <w:r>
+        <w:rPr>
+          <w:sz w:val="18"/>
+          <w:szCs w:val="18"/>
+          <w:lang w:val="en-IN"/>
+        </w:rPr>
+        <w:t>restTemplate</w:t>
+      </w:r>
+      <w:proofErr w:type="spellEnd"/>
+      <w:r>
+        <w:rPr>
+          <w:sz w:val="18"/>
+          <w:szCs w:val="18"/>
+          <w:lang w:val="en-IN"/>
+        </w:rPr>
+        <w:t>;</w:t>
       </w:r>
       <w:r>
         <w:rPr>
@@ -1802,7 +2911,25 @@
           <w:szCs w:val="18"/>
           <w:lang w:val="en-IN"/>
         </w:rPr>
-        <w:t>public String getStudentName() {</w:t>
+        <w:t xml:space="preserve">public String </w:t>
+      </w:r>
+      <w:proofErr w:type="spellStart"/>
+      <w:r>
+        <w:rPr>
+          <w:sz w:val="18"/>
+          <w:szCs w:val="18"/>
+          <w:lang w:val="en-IN"/>
+        </w:rPr>
+        <w:t>getStudentName</w:t>
+      </w:r>
+      <w:proofErr w:type="spellEnd"/>
+      <w:r>
+        <w:rPr>
+          <w:sz w:val="18"/>
+          <w:szCs w:val="18"/>
+          <w:lang w:val="en-IN"/>
+        </w:rPr>
+        <w:t>() {</w:t>
       </w:r>
       <w:r>
         <w:rPr>
@@ -1846,13 +2973,41 @@
         <w:br/>
         <w:t xml:space="preserve"> </w:t>
       </w:r>
-      <w:r>
-        <w:rPr>
-          <w:sz w:val="18"/>
-          <w:szCs w:val="18"/>
-          <w:lang w:val="en-IN"/>
-        </w:rPr>
-        <w:t>ResponseEntity&lt;String&gt; response = restTemplate.getForEntity("http://student-microservice/getStudentName", String.class);</w:t>
+      <w:proofErr w:type="spellStart"/>
+      <w:r>
+        <w:rPr>
+          <w:sz w:val="18"/>
+          <w:szCs w:val="18"/>
+          <w:lang w:val="en-IN"/>
+        </w:rPr>
+        <w:t>ResponseEntity</w:t>
+      </w:r>
+      <w:proofErr w:type="spellEnd"/>
+      <w:r>
+        <w:rPr>
+          <w:sz w:val="18"/>
+          <w:szCs w:val="18"/>
+          <w:lang w:val="en-IN"/>
+        </w:rPr>
+        <w:t xml:space="preserve">&lt;String&gt; response = restTemplate.getForEntity("http://student-microservice/getStudentName", </w:t>
+      </w:r>
+      <w:proofErr w:type="spellStart"/>
+      <w:r>
+        <w:rPr>
+          <w:sz w:val="18"/>
+          <w:szCs w:val="18"/>
+          <w:lang w:val="en-IN"/>
+        </w:rPr>
+        <w:t>String.class</w:t>
+      </w:r>
+      <w:proofErr w:type="spellEnd"/>
+      <w:r>
+        <w:rPr>
+          <w:sz w:val="18"/>
+          <w:szCs w:val="18"/>
+          <w:lang w:val="en-IN"/>
+        </w:rPr>
+        <w:t>);</w:t>
       </w:r>
       <w:r>
         <w:rPr>
@@ -1868,7 +3023,25 @@
           <w:szCs w:val="18"/>
           <w:lang w:val="en-IN"/>
         </w:rPr>
-        <w:t>return response.getBody();</w:t>
+        <w:t xml:space="preserve">return </w:t>
+      </w:r>
+      <w:proofErr w:type="spellStart"/>
+      <w:r>
+        <w:rPr>
+          <w:sz w:val="18"/>
+          <w:szCs w:val="18"/>
+          <w:lang w:val="en-IN"/>
+        </w:rPr>
+        <w:t>response.getBody</w:t>
+      </w:r>
+      <w:proofErr w:type="spellEnd"/>
+      <w:r>
+        <w:rPr>
+          <w:sz w:val="18"/>
+          <w:szCs w:val="18"/>
+          <w:lang w:val="en-IN"/>
+        </w:rPr>
+        <w:t>();</w:t>
       </w:r>
       <w:r>
         <w:rPr>
@@ -1884,7 +3057,25 @@
           <w:szCs w:val="18"/>
           <w:lang w:val="en-IN"/>
         </w:rPr>
-        <w:t>} catch (ResourceAccessException ex) {</w:t>
+        <w:t>} catch (</w:t>
+      </w:r>
+      <w:proofErr w:type="spellStart"/>
+      <w:r>
+        <w:rPr>
+          <w:sz w:val="18"/>
+          <w:szCs w:val="18"/>
+          <w:lang w:val="en-IN"/>
+        </w:rPr>
+        <w:t>ResourceAccessException</w:t>
+      </w:r>
+      <w:proofErr w:type="spellEnd"/>
+      <w:r>
+        <w:rPr>
+          <w:sz w:val="18"/>
+          <w:szCs w:val="18"/>
+          <w:lang w:val="en-IN"/>
+        </w:rPr>
+        <w:t xml:space="preserve"> ex) {</w:t>
       </w:r>
       <w:r>
         <w:rPr>
@@ -1909,7 +3100,25 @@
           <w:szCs w:val="18"/>
           <w:lang w:val="en-IN"/>
         </w:rPr>
-        <w:t>throw new RequestTimeoutException("request timed out. Please try later");</w:t>
+        <w:t xml:space="preserve">throw new </w:t>
+      </w:r>
+      <w:proofErr w:type="spellStart"/>
+      <w:r>
+        <w:rPr>
+          <w:sz w:val="18"/>
+          <w:szCs w:val="18"/>
+          <w:lang w:val="en-IN"/>
+        </w:rPr>
+        <w:t>RequestTimeoutException</w:t>
+      </w:r>
+      <w:proofErr w:type="spellEnd"/>
+      <w:r>
+        <w:rPr>
+          <w:sz w:val="18"/>
+          <w:szCs w:val="18"/>
+          <w:lang w:val="en-IN"/>
+        </w:rPr>
+        <w:t>("request timed out. Please try later");</w:t>
       </w:r>
       <w:r>
         <w:rPr>
@@ -1938,24 +3147,134 @@
         <w:rPr>
           <w:lang w:val="en-IN"/>
         </w:rPr>
-        <w:t>Use Resilience4J, It provides @TimeLimiter annotation. It should be annotated to the method which calls another microservice. This annotation should be used in conjuction with @CircuitBreaker.</w:t>
-      </w:r>
-    </w:p>
-    <w:p>
-      <w:pPr>
-        <w:rPr>
-          <w:sz w:val="18"/>
-          <w:szCs w:val="18"/>
-          <w:lang w:val="en-IN"/>
-        </w:rPr>
-      </w:pPr>
-      <w:r>
-        <w:rPr>
-          <w:sz w:val="18"/>
-          <w:szCs w:val="18"/>
-          <w:lang w:val="en-IN"/>
-        </w:rPr>
-        <w:t>@TimeLimiter(name = "studentService", fallbackMethod = "fallback")</w:t>
+        <w:t>Use Resilience4J, It provides @</w:t>
+      </w:r>
+      <w:proofErr w:type="spellStart"/>
+      <w:r>
+        <w:rPr>
+          <w:lang w:val="en-IN"/>
+        </w:rPr>
+        <w:t>TimeLimiter</w:t>
+      </w:r>
+      <w:proofErr w:type="spellEnd"/>
+      <w:r>
+        <w:rPr>
+          <w:lang w:val="en-IN"/>
+        </w:rPr>
+        <w:t xml:space="preserve"> annotation. It should be annotated to the method which calls another </w:t>
+      </w:r>
+      <w:proofErr w:type="spellStart"/>
+      <w:r>
+        <w:rPr>
+          <w:lang w:val="en-IN"/>
+        </w:rPr>
+        <w:t>microservice</w:t>
+      </w:r>
+      <w:proofErr w:type="spellEnd"/>
+      <w:r>
+        <w:rPr>
+          <w:lang w:val="en-IN"/>
+        </w:rPr>
+        <w:t xml:space="preserve">. This annotation should be used in </w:t>
+      </w:r>
+      <w:proofErr w:type="spellStart"/>
+      <w:r>
+        <w:rPr>
+          <w:lang w:val="en-IN"/>
+        </w:rPr>
+        <w:t>conjuction</w:t>
+      </w:r>
+      <w:proofErr w:type="spellEnd"/>
+      <w:r>
+        <w:rPr>
+          <w:lang w:val="en-IN"/>
+        </w:rPr>
+        <w:t xml:space="preserve"> with @</w:t>
+      </w:r>
+      <w:proofErr w:type="spellStart"/>
+      <w:r>
+        <w:rPr>
+          <w:lang w:val="en-IN"/>
+        </w:rPr>
+        <w:t>CircuitBreaker</w:t>
+      </w:r>
+      <w:proofErr w:type="spellEnd"/>
+      <w:r>
+        <w:rPr>
+          <w:lang w:val="en-IN"/>
+        </w:rPr>
+        <w:t>.</w:t>
+      </w:r>
+    </w:p>
+    <w:p>
+      <w:pPr>
+        <w:rPr>
+          <w:sz w:val="18"/>
+          <w:szCs w:val="18"/>
+          <w:lang w:val="en-IN"/>
+        </w:rPr>
+      </w:pPr>
+      <w:r>
+        <w:rPr>
+          <w:sz w:val="18"/>
+          <w:szCs w:val="18"/>
+          <w:lang w:val="en-IN"/>
+        </w:rPr>
+        <w:t>@</w:t>
+      </w:r>
+      <w:proofErr w:type="spellStart"/>
+      <w:r>
+        <w:rPr>
+          <w:sz w:val="18"/>
+          <w:szCs w:val="18"/>
+          <w:lang w:val="en-IN"/>
+        </w:rPr>
+        <w:t>TimeLimiter</w:t>
+      </w:r>
+      <w:proofErr w:type="spellEnd"/>
+      <w:r>
+        <w:rPr>
+          <w:sz w:val="18"/>
+          <w:szCs w:val="18"/>
+          <w:lang w:val="en-IN"/>
+        </w:rPr>
+        <w:t>(name = "</w:t>
+      </w:r>
+      <w:proofErr w:type="spellStart"/>
+      <w:r>
+        <w:rPr>
+          <w:sz w:val="18"/>
+          <w:szCs w:val="18"/>
+          <w:lang w:val="en-IN"/>
+        </w:rPr>
+        <w:t>studentService</w:t>
+      </w:r>
+      <w:proofErr w:type="spellEnd"/>
+      <w:r>
+        <w:rPr>
+          <w:sz w:val="18"/>
+          <w:szCs w:val="18"/>
+          <w:lang w:val="en-IN"/>
+        </w:rPr>
+        <w:t xml:space="preserve">", </w:t>
+      </w:r>
+      <w:proofErr w:type="spellStart"/>
+      <w:r>
+        <w:rPr>
+          <w:sz w:val="18"/>
+          <w:szCs w:val="18"/>
+          <w:lang w:val="en-IN"/>
+        </w:rPr>
+        <w:t>fallbackMethod</w:t>
+      </w:r>
+      <w:proofErr w:type="spellEnd"/>
+      <w:r>
+        <w:rPr>
+          <w:sz w:val="18"/>
+          <w:szCs w:val="18"/>
+          <w:lang w:val="en-IN"/>
+        </w:rPr>
+        <w:t xml:space="preserve"> = "fallback")</w:t>
       </w:r>
       <w:r>
         <w:rPr>
@@ -1971,7 +3290,61 @@
           <w:szCs w:val="18"/>
           <w:lang w:val="en-IN"/>
         </w:rPr>
-        <w:t>@CircuitBreaker(name = "studentService", fallbackMethod = "fallback")</w:t>
+        <w:t>@</w:t>
+      </w:r>
+      <w:proofErr w:type="spellStart"/>
+      <w:r>
+        <w:rPr>
+          <w:sz w:val="18"/>
+          <w:szCs w:val="18"/>
+          <w:lang w:val="en-IN"/>
+        </w:rPr>
+        <w:t>CircuitBreaker</w:t>
+      </w:r>
+      <w:proofErr w:type="spellEnd"/>
+      <w:r>
+        <w:rPr>
+          <w:sz w:val="18"/>
+          <w:szCs w:val="18"/>
+          <w:lang w:val="en-IN"/>
+        </w:rPr>
+        <w:t>(name = "</w:t>
+      </w:r>
+      <w:proofErr w:type="spellStart"/>
+      <w:r>
+        <w:rPr>
+          <w:sz w:val="18"/>
+          <w:szCs w:val="18"/>
+          <w:lang w:val="en-IN"/>
+        </w:rPr>
+        <w:t>studentService</w:t>
+      </w:r>
+      <w:proofErr w:type="spellEnd"/>
+      <w:r>
+        <w:rPr>
+          <w:sz w:val="18"/>
+          <w:szCs w:val="18"/>
+          <w:lang w:val="en-IN"/>
+        </w:rPr>
+        <w:t xml:space="preserve">", </w:t>
+      </w:r>
+      <w:proofErr w:type="spellStart"/>
+      <w:r>
+        <w:rPr>
+          <w:sz w:val="18"/>
+          <w:szCs w:val="18"/>
+          <w:lang w:val="en-IN"/>
+        </w:rPr>
+        <w:t>fallbackMethod</w:t>
+      </w:r>
+      <w:proofErr w:type="spellEnd"/>
+      <w:r>
+        <w:rPr>
+          <w:sz w:val="18"/>
+          <w:szCs w:val="18"/>
+          <w:lang w:val="en-IN"/>
+        </w:rPr>
+        <w:t xml:space="preserve"> = "fallback")</w:t>
       </w:r>
       <w:r>
         <w:rPr>
@@ -1987,7 +3360,43 @@
           <w:szCs w:val="18"/>
           <w:lang w:val="en-IN"/>
         </w:rPr>
-        <w:t>public CompletableFuture&lt;String&gt; callStudentService() {</w:t>
+        <w:t xml:space="preserve">public </w:t>
+      </w:r>
+      <w:proofErr w:type="spellStart"/>
+      <w:r>
+        <w:rPr>
+          <w:sz w:val="18"/>
+          <w:szCs w:val="18"/>
+          <w:lang w:val="en-IN"/>
+        </w:rPr>
+        <w:t>CompletableFuture</w:t>
+      </w:r>
+      <w:proofErr w:type="spellEnd"/>
+      <w:r>
+        <w:rPr>
+          <w:sz w:val="18"/>
+          <w:szCs w:val="18"/>
+          <w:lang w:val="en-IN"/>
+        </w:rPr>
+        <w:t xml:space="preserve">&lt;String&gt; </w:t>
+      </w:r>
+      <w:proofErr w:type="spellStart"/>
+      <w:r>
+        <w:rPr>
+          <w:sz w:val="18"/>
+          <w:szCs w:val="18"/>
+          <w:lang w:val="en-IN"/>
+        </w:rPr>
+        <w:t>callStudentService</w:t>
+      </w:r>
+      <w:proofErr w:type="spellEnd"/>
+      <w:r>
+        <w:rPr>
+          <w:sz w:val="18"/>
+          <w:szCs w:val="18"/>
+          <w:lang w:val="en-IN"/>
+        </w:rPr>
+        <w:t>() {</w:t>
       </w:r>
       <w:r>
         <w:rPr>
@@ -2003,7 +3412,43 @@
           <w:szCs w:val="17"/>
           <w:lang w:val="en-IN"/>
         </w:rPr>
-        <w:t>return CompletableFuture.supplyAsync(() -&gt; restTemplate.getForObject("http://student-service/getStudentName", String.class)); }</w:t>
+        <w:t xml:space="preserve">return </w:t>
+      </w:r>
+      <w:proofErr w:type="spellStart"/>
+      <w:r>
+        <w:rPr>
+          <w:sz w:val="17"/>
+          <w:szCs w:val="17"/>
+          <w:lang w:val="en-IN"/>
+        </w:rPr>
+        <w:t>CompletableFuture.supplyAsync</w:t>
+      </w:r>
+      <w:proofErr w:type="spellEnd"/>
+      <w:r>
+        <w:rPr>
+          <w:sz w:val="17"/>
+          <w:szCs w:val="17"/>
+          <w:lang w:val="en-IN"/>
+        </w:rPr>
+        <w:t xml:space="preserve">(() -&gt; restTemplate.getForObject("http://student-service/getStudentName", </w:t>
+      </w:r>
+      <w:proofErr w:type="spellStart"/>
+      <w:r>
+        <w:rPr>
+          <w:sz w:val="17"/>
+          <w:szCs w:val="17"/>
+          <w:lang w:val="en-IN"/>
+        </w:rPr>
+        <w:t>String.class</w:t>
+      </w:r>
+      <w:proofErr w:type="spellEnd"/>
+      <w:r>
+        <w:rPr>
+          <w:sz w:val="17"/>
+          <w:szCs w:val="17"/>
+          <w:lang w:val="en-IN"/>
+        </w:rPr>
+        <w:t>)); }</w:t>
       </w:r>
       <w:r>
         <w:rPr>
@@ -2019,7 +3464,43 @@
           <w:szCs w:val="18"/>
           <w:lang w:val="en-IN"/>
         </w:rPr>
-        <w:t>private CompletableFuture&lt;String&gt; fallback(Throwable ex) {</w:t>
+        <w:t xml:space="preserve">private </w:t>
+      </w:r>
+      <w:proofErr w:type="spellStart"/>
+      <w:r>
+        <w:rPr>
+          <w:sz w:val="18"/>
+          <w:szCs w:val="18"/>
+          <w:lang w:val="en-IN"/>
+        </w:rPr>
+        <w:t>CompletableFuture</w:t>
+      </w:r>
+      <w:proofErr w:type="spellEnd"/>
+      <w:r>
+        <w:rPr>
+          <w:sz w:val="18"/>
+          <w:szCs w:val="18"/>
+          <w:lang w:val="en-IN"/>
+        </w:rPr>
+        <w:t>&lt;String&gt; fallback(</w:t>
+      </w:r>
+      <w:proofErr w:type="spellStart"/>
+      <w:r>
+        <w:rPr>
+          <w:sz w:val="18"/>
+          <w:szCs w:val="18"/>
+          <w:lang w:val="en-IN"/>
+        </w:rPr>
+        <w:t>Throwable</w:t>
+      </w:r>
+      <w:proofErr w:type="spellEnd"/>
+      <w:r>
+        <w:rPr>
+          <w:sz w:val="18"/>
+          <w:szCs w:val="18"/>
+          <w:lang w:val="en-IN"/>
+        </w:rPr>
+        <w:t xml:space="preserve"> ex) {</w:t>
       </w:r>
       <w:r>
         <w:rPr>
@@ -2044,7 +3525,25 @@
           <w:szCs w:val="18"/>
           <w:lang w:val="en-IN"/>
         </w:rPr>
-        <w:t>return CompletableFuture.completedFuture("Request timed out. Please try later");</w:t>
+        <w:t xml:space="preserve">return </w:t>
+      </w:r>
+      <w:proofErr w:type="spellStart"/>
+      <w:r>
+        <w:rPr>
+          <w:sz w:val="18"/>
+          <w:szCs w:val="18"/>
+          <w:lang w:val="en-IN"/>
+        </w:rPr>
+        <w:t>CompletableFuture.completedFuture</w:t>
+      </w:r>
+      <w:proofErr w:type="spellEnd"/>
+      <w:r>
+        <w:rPr>
+          <w:sz w:val="18"/>
+          <w:szCs w:val="18"/>
+          <w:lang w:val="en-IN"/>
+        </w:rPr>
+        <w:t>("Request timed out. Please try later");</w:t>
       </w:r>
       <w:r>
         <w:rPr>
@@ -2077,8 +3576,77 @@
           <w:szCs w:val="18"/>
           <w:lang w:val="en-IN"/>
         </w:rPr>
+        <w:t xml:space="preserve"># ===== Resilience4j </w:t>
+      </w:r>
+      <w:proofErr w:type="spellStart"/>
+      <w:r>
+        <w:rPr>
+          <w:sz w:val="18"/>
+          <w:szCs w:val="18"/>
+          <w:lang w:val="en-IN"/>
+        </w:rPr>
+        <w:t>TimeLimiter</w:t>
+      </w:r>
+      <w:proofErr w:type="spellEnd"/>
+      <w:r>
+        <w:rPr>
+          <w:sz w:val="18"/>
+          <w:szCs w:val="18"/>
+          <w:lang w:val="en-IN"/>
+        </w:rPr>
+        <w:t xml:space="preserve"> Configuration =====</w:t>
+      </w:r>
+      <w:r>
+        <w:rPr>
+          <w:sz w:val="18"/>
+          <w:szCs w:val="18"/>
+          <w:lang w:val="en-IN"/>
+        </w:rPr>
+        <w:br/>
+      </w:r>
+      <w:r>
+        <w:rPr>
+          <w:sz w:val="18"/>
+          <w:szCs w:val="18"/>
+          <w:lang w:val="en-IN"/>
+        </w:rPr>
+        <w:t>resilience4j.timelimiter.instances.studentService.timeout-duration=10s</w:t>
+      </w:r>
+    </w:p>
+    <w:p>
+      <w:pPr>
+        <w:rPr>
+          <w:sz w:val="18"/>
+          <w:szCs w:val="18"/>
+          <w:lang w:val="en-IN"/>
+        </w:rPr>
+      </w:pPr>
+      <w:r>
+        <w:rPr>
+          <w:sz w:val="18"/>
+          <w:szCs w:val="18"/>
+          <w:lang w:val="en-IN"/>
+        </w:rPr>
         <w:lastRenderedPageBreak/>
-        <w:t># ===== Resilience4j TimeLimiter Configuration =====</w:t>
+        <w:t xml:space="preserve"># ===== Resilience4j </w:t>
+      </w:r>
+      <w:proofErr w:type="spellStart"/>
+      <w:r>
+        <w:rPr>
+          <w:sz w:val="18"/>
+          <w:szCs w:val="18"/>
+          <w:lang w:val="en-IN"/>
+        </w:rPr>
+        <w:t>CircuitBreaker</w:t>
+      </w:r>
+      <w:proofErr w:type="spellEnd"/>
+      <w:r>
+        <w:rPr>
+          <w:sz w:val="18"/>
+          <w:szCs w:val="18"/>
+          <w:lang w:val="en-IN"/>
+        </w:rPr>
+        <w:t xml:space="preserve"> Configuration =====</w:t>
       </w:r>
       <w:r>
         <w:rPr>
@@ -2094,24 +3662,7 @@
           <w:szCs w:val="18"/>
           <w:lang w:val="en-IN"/>
         </w:rPr>
-        <w:t>resilience4j.timelimiter.instances.studentService.timeout-duration=10s</w:t>
-      </w:r>
-    </w:p>
-    <w:p>
-      <w:pPr>
-        <w:rPr>
-          <w:sz w:val="18"/>
-          <w:szCs w:val="18"/>
-          <w:lang w:val="en-IN"/>
-        </w:rPr>
-      </w:pPr>
-      <w:r>
-        <w:rPr>
-          <w:sz w:val="18"/>
-          <w:szCs w:val="18"/>
-          <w:lang w:val="en-IN"/>
-        </w:rPr>
-        <w:t># ===== Resilience4j CircuitBreaker Configuration =====</w:t>
+        <w:t>resilience4j.circuitbreaker.instances.studentService.sliding-window-size=10</w:t>
       </w:r>
       <w:r>
         <w:rPr>
@@ -2127,7 +3678,7 @@
           <w:szCs w:val="18"/>
           <w:lang w:val="en-IN"/>
         </w:rPr>
-        <w:t>resilience4j.circuitbreaker.instances.studentService.sliding-window-size=10</w:t>
+        <w:t>resilience4j.circuitbreaker.instances.studentService.failure-rate-threshold=50</w:t>
       </w:r>
       <w:r>
         <w:rPr>
@@ -2143,22 +3694,6 @@
           <w:szCs w:val="18"/>
           <w:lang w:val="en-IN"/>
         </w:rPr>
-        <w:t>resilience4j.circuitbreaker.instances.studentService.failure-rate-threshold=50</w:t>
-      </w:r>
-      <w:r>
-        <w:rPr>
-          <w:sz w:val="18"/>
-          <w:szCs w:val="18"/>
-          <w:lang w:val="en-IN"/>
-        </w:rPr>
-        <w:br/>
-      </w:r>
-      <w:r>
-        <w:rPr>
-          <w:sz w:val="18"/>
-          <w:szCs w:val="18"/>
-          <w:lang w:val="en-IN"/>
-        </w:rPr>
         <w:t>resilience4j.circuitbreaker.instances.studentService.wait-duration-in-open-state=30s</w:t>
       </w:r>
     </w:p>
@@ -2185,7 +3720,35 @@
         <w:rPr>
           <w:lang w:val="en-IN"/>
         </w:rPr>
-        <w:t>If I just want to stop waiting after 10 seconds, I can configure HTTP timeouts directly using Apache HttpClient + RequestConfig, which is simple and efficient.</w:t>
+        <w:t xml:space="preserve">If I just want to stop waiting after 10 seconds, I can configure HTTP timeouts directly using Apache </w:t>
+      </w:r>
+      <w:proofErr w:type="spellStart"/>
+      <w:r>
+        <w:rPr>
+          <w:lang w:val="en-IN"/>
+        </w:rPr>
+        <w:t>HttpClient</w:t>
+      </w:r>
+      <w:proofErr w:type="spellEnd"/>
+      <w:r>
+        <w:rPr>
+          <w:lang w:val="en-IN"/>
+        </w:rPr>
+        <w:t xml:space="preserve"> + </w:t>
+      </w:r>
+      <w:proofErr w:type="spellStart"/>
+      <w:r>
+        <w:rPr>
+          <w:lang w:val="en-IN"/>
+        </w:rPr>
+        <w:t>RequestConfig</w:t>
+      </w:r>
+      <w:proofErr w:type="spellEnd"/>
+      <w:r>
+        <w:rPr>
+          <w:lang w:val="en-IN"/>
+        </w:rPr>
+        <w:t>, which is simple and efficient.</w:t>
       </w:r>
     </w:p>
     <w:p>
@@ -2204,7 +3767,35 @@
         <w:rPr>
           <w:lang w:val="en-IN"/>
         </w:rPr>
-        <w:t xml:space="preserve">n Apache HttpClient + RequestConfig: </w:t>
+        <w:t xml:space="preserve">n Apache </w:t>
+      </w:r>
+      <w:proofErr w:type="spellStart"/>
+      <w:r>
+        <w:rPr>
+          <w:lang w:val="en-IN"/>
+        </w:rPr>
+        <w:t>HttpClient</w:t>
+      </w:r>
+      <w:proofErr w:type="spellEnd"/>
+      <w:r>
+        <w:rPr>
+          <w:lang w:val="en-IN"/>
+        </w:rPr>
+        <w:t xml:space="preserve"> + </w:t>
+      </w:r>
+      <w:proofErr w:type="spellStart"/>
+      <w:r>
+        <w:rPr>
+          <w:lang w:val="en-IN"/>
+        </w:rPr>
+        <w:t>RequestConfig</w:t>
+      </w:r>
+      <w:proofErr w:type="spellEnd"/>
+      <w:r>
+        <w:rPr>
+          <w:lang w:val="en-IN"/>
+        </w:rPr>
+        <w:t xml:space="preserve">: </w:t>
       </w:r>
     </w:p>
     <w:p>
@@ -2240,7 +3831,21 @@
         <w:rPr>
           <w:lang w:val="en-IN"/>
         </w:rPr>
-        <w:t>Doesn’t prevent cascading failures if the downstream service is slow/unhealthy.</w:t>
+        <w:t xml:space="preserve">Doesn’t prevent cascading failures if the downstream service is </w:t>
+      </w:r>
+      <w:proofErr w:type="gramStart"/>
+      <w:r>
+        <w:rPr>
+          <w:lang w:val="en-IN"/>
+        </w:rPr>
+        <w:t>slow/unhealthy</w:t>
+      </w:r>
+      <w:proofErr w:type="gramEnd"/>
+      <w:r>
+        <w:rPr>
+          <w:lang w:val="en-IN"/>
+        </w:rPr>
+        <w:t>.</w:t>
       </w:r>
     </w:p>
     <w:p>
@@ -2289,7 +3894,35 @@
         <w:rPr>
           <w:lang w:val="en-IN"/>
         </w:rPr>
-        <w:t>In a real microservices architecture, where we need to handle slow or failing downstream services gracefully, it’s better to use Resilience4j with @TimeLimiter and @CircuitBreaker.</w:t>
+        <w:t>In a real microservices architecture, where we need to handle slow or failing downstream services gracefully, it’s better to use Resilience4j with @</w:t>
+      </w:r>
+      <w:proofErr w:type="spellStart"/>
+      <w:r>
+        <w:rPr>
+          <w:lang w:val="en-IN"/>
+        </w:rPr>
+        <w:t>TimeLimiter</w:t>
+      </w:r>
+      <w:proofErr w:type="spellEnd"/>
+      <w:r>
+        <w:rPr>
+          <w:lang w:val="en-IN"/>
+        </w:rPr>
+        <w:t xml:space="preserve"> and @</w:t>
+      </w:r>
+      <w:proofErr w:type="spellStart"/>
+      <w:r>
+        <w:rPr>
+          <w:lang w:val="en-IN"/>
+        </w:rPr>
+        <w:t>CircuitBreaker</w:t>
+      </w:r>
+      <w:proofErr w:type="spellEnd"/>
+      <w:r>
+        <w:rPr>
+          <w:lang w:val="en-IN"/>
+        </w:rPr>
+        <w:t>.</w:t>
       </w:r>
     </w:p>
     <w:p>
@@ -2372,11 +4005,19 @@
           <w:lang w:val="en-IN"/>
         </w:rPr>
       </w:pPr>
-      <w:r>
-        <w:rPr>
-          <w:lang w:val="en-IN"/>
-        </w:rPr>
-        <w:t>monitor resilience metrics.</w:t>
+      <w:proofErr w:type="gramStart"/>
+      <w:r>
+        <w:rPr>
+          <w:lang w:val="en-IN"/>
+        </w:rPr>
+        <w:t>monitor</w:t>
+      </w:r>
+      <w:proofErr w:type="gramEnd"/>
+      <w:r>
+        <w:rPr>
+          <w:lang w:val="en-IN"/>
+        </w:rPr>
+        <w:t xml:space="preserve"> resilience metrics.</w:t>
       </w:r>
       <w:r>
         <w:rPr>
@@ -2615,13 +4256,38 @@
           <w:lang w:val="en-IN"/>
         </w:rPr>
         <w:lastRenderedPageBreak/>
-        <w:t>Similarity &amp; Difference between getForEntity &amp; getForObject</w:t>
-      </w:r>
+        <w:t xml:space="preserve">Similarity &amp; Difference between </w:t>
+      </w:r>
+      <w:proofErr w:type="spellStart"/>
       <w:r>
         <w:rPr>
           <w:b/>
           <w:lang w:val="en-IN"/>
         </w:rPr>
+        <w:t>getForEntity</w:t>
+      </w:r>
+      <w:proofErr w:type="spellEnd"/>
+      <w:r>
+        <w:rPr>
+          <w:b/>
+          <w:lang w:val="en-IN"/>
+        </w:rPr>
+        <w:t xml:space="preserve"> &amp; </w:t>
+      </w:r>
+      <w:proofErr w:type="spellStart"/>
+      <w:r>
+        <w:rPr>
+          <w:b/>
+          <w:lang w:val="en-IN"/>
+        </w:rPr>
+        <w:t>getForObject</w:t>
+      </w:r>
+      <w:proofErr w:type="spellEnd"/>
+      <w:r>
+        <w:rPr>
+          <w:b/>
+          <w:lang w:val="en-IN"/>
+        </w:rPr>
         <w:t xml:space="preserve"> (Not so important)</w:t>
       </w:r>
     </w:p>
@@ -2631,11 +4297,47 @@
           <w:lang w:val="en-IN"/>
         </w:rPr>
       </w:pPr>
-      <w:r>
-        <w:rPr>
-          <w:lang w:val="en-IN"/>
-        </w:rPr>
-        <w:t xml:space="preserve">both getForEntity and getForObject are methods </w:t>
+      <w:proofErr w:type="gramStart"/>
+      <w:r>
+        <w:rPr>
+          <w:lang w:val="en-IN"/>
+        </w:rPr>
+        <w:t>both</w:t>
+      </w:r>
+      <w:proofErr w:type="gramEnd"/>
+      <w:r>
+        <w:rPr>
+          <w:lang w:val="en-IN"/>
+        </w:rPr>
+        <w:t xml:space="preserve"> </w:t>
+      </w:r>
+      <w:proofErr w:type="spellStart"/>
+      <w:r>
+        <w:rPr>
+          <w:lang w:val="en-IN"/>
+        </w:rPr>
+        <w:t>getForEntity</w:t>
+      </w:r>
+      <w:proofErr w:type="spellEnd"/>
+      <w:r>
+        <w:rPr>
+          <w:lang w:val="en-IN"/>
+        </w:rPr>
+        <w:t xml:space="preserve"> and </w:t>
+      </w:r>
+      <w:proofErr w:type="spellStart"/>
+      <w:r>
+        <w:rPr>
+          <w:lang w:val="en-IN"/>
+        </w:rPr>
+        <w:t>getForObject</w:t>
+      </w:r>
+      <w:proofErr w:type="spellEnd"/>
+      <w:r>
+        <w:rPr>
+          <w:lang w:val="en-IN"/>
+        </w:rPr>
+        <w:t xml:space="preserve"> are methods </w:t>
       </w:r>
       <w:r>
         <w:rPr>
@@ -2663,12 +4365,50 @@
           <w:lang w:val="en-IN"/>
         </w:rPr>
       </w:pPr>
-      <w:r>
-        <w:rPr>
-          <w:lang w:val="en-IN"/>
-        </w:rPr>
-        <w:t>Where as postForEntity and postForObject are used to make HTTP POST requests to send the data to a remote service or API.</w:t>
-      </w:r>
+      <w:proofErr w:type="spellStart"/>
+      <w:proofErr w:type="gramStart"/>
+      <w:r>
+        <w:rPr>
+          <w:lang w:val="en-IN"/>
+        </w:rPr>
+        <w:t>Where as</w:t>
+      </w:r>
+      <w:proofErr w:type="spellEnd"/>
+      <w:r>
+        <w:rPr>
+          <w:lang w:val="en-IN"/>
+        </w:rPr>
+        <w:t xml:space="preserve"> </w:t>
+      </w:r>
+      <w:proofErr w:type="spellStart"/>
+      <w:r>
+        <w:rPr>
+          <w:lang w:val="en-IN"/>
+        </w:rPr>
+        <w:t>postForEntity</w:t>
+      </w:r>
+      <w:proofErr w:type="spellEnd"/>
+      <w:r>
+        <w:rPr>
+          <w:lang w:val="en-IN"/>
+        </w:rPr>
+        <w:t xml:space="preserve"> and </w:t>
+      </w:r>
+      <w:proofErr w:type="spellStart"/>
+      <w:r>
+        <w:rPr>
+          <w:lang w:val="en-IN"/>
+        </w:rPr>
+        <w:t>postForObject</w:t>
+      </w:r>
+      <w:proofErr w:type="spellEnd"/>
+      <w:r>
+        <w:rPr>
+          <w:lang w:val="en-IN"/>
+        </w:rPr>
+        <w:t xml:space="preserve"> are used to make HTTP POST requests to send the data to a remote service or API.</w:t>
+      </w:r>
+      <w:proofErr w:type="gramEnd"/>
     </w:p>
     <w:p>
       <w:pPr>
@@ -2719,11 +4459,35 @@
           <w:lang w:val="en-IN"/>
         </w:rPr>
       </w:pPr>
-      <w:r>
-        <w:rPr>
-          <w:lang w:val="en-IN"/>
-        </w:rPr>
-        <w:t>getForEntity returns a ResponseEntity containing the full HTTP response (status, headers, body).</w:t>
+      <w:proofErr w:type="spellStart"/>
+      <w:proofErr w:type="gramStart"/>
+      <w:r>
+        <w:rPr>
+          <w:lang w:val="en-IN"/>
+        </w:rPr>
+        <w:t>getForEntity</w:t>
+      </w:r>
+      <w:proofErr w:type="spellEnd"/>
+      <w:proofErr w:type="gramEnd"/>
+      <w:r>
+        <w:rPr>
+          <w:lang w:val="en-IN"/>
+        </w:rPr>
+        <w:t xml:space="preserve"> returns a </w:t>
+      </w:r>
+      <w:proofErr w:type="spellStart"/>
+      <w:r>
+        <w:rPr>
+          <w:lang w:val="en-IN"/>
+        </w:rPr>
+        <w:t>ResponseEntity</w:t>
+      </w:r>
+      <w:proofErr w:type="spellEnd"/>
+      <w:r>
+        <w:rPr>
+          <w:lang w:val="en-IN"/>
+        </w:rPr>
+        <w:t xml:space="preserve"> containing the full HTTP response (status, headers, body).</w:t>
       </w:r>
     </w:p>
     <w:p>
@@ -2737,11 +4501,21 @@
           <w:lang w:val="en-IN"/>
         </w:rPr>
       </w:pPr>
-      <w:r>
-        <w:rPr>
-          <w:lang w:val="en-IN"/>
-        </w:rPr>
-        <w:t>getForObject returns the parsed response body directly, without the HTTP response metadata.</w:t>
+      <w:proofErr w:type="spellStart"/>
+      <w:proofErr w:type="gramStart"/>
+      <w:r>
+        <w:rPr>
+          <w:lang w:val="en-IN"/>
+        </w:rPr>
+        <w:t>getForObject</w:t>
+      </w:r>
+      <w:proofErr w:type="spellEnd"/>
+      <w:proofErr w:type="gramEnd"/>
+      <w:r>
+        <w:rPr>
+          <w:lang w:val="en-IN"/>
+        </w:rPr>
+        <w:t xml:space="preserve"> returns the parsed response body directly, without the HTTP response metadata.</w:t>
       </w:r>
     </w:p>
     <w:p>
@@ -2784,7 +4558,21 @@
         <w:rPr>
           <w:lang w:val="en-IN"/>
         </w:rPr>
-        <w:t>Use getForEntity when you need access to the complete HTTP response, including headers and status, in addition to the response body.</w:t>
+        <w:t xml:space="preserve">Use </w:t>
+      </w:r>
+      <w:proofErr w:type="spellStart"/>
+      <w:r>
+        <w:rPr>
+          <w:lang w:val="en-IN"/>
+        </w:rPr>
+        <w:t>getForEntity</w:t>
+      </w:r>
+      <w:proofErr w:type="spellEnd"/>
+      <w:r>
+        <w:rPr>
+          <w:lang w:val="en-IN"/>
+        </w:rPr>
+        <w:t xml:space="preserve"> when you need access to the complete HTTP response, including headers and status, in addition to the response body.</w:t>
       </w:r>
     </w:p>
     <w:p>
@@ -2802,7 +4590,21 @@
         <w:rPr>
           <w:lang w:val="en-IN"/>
         </w:rPr>
-        <w:t>Use getForObject when you are primarily interested in the response body and want a more concise way to retrieve it.</w:t>
+        <w:t xml:space="preserve">Use </w:t>
+      </w:r>
+      <w:proofErr w:type="spellStart"/>
+      <w:r>
+        <w:rPr>
+          <w:lang w:val="en-IN"/>
+        </w:rPr>
+        <w:t>getForObject</w:t>
+      </w:r>
+      <w:proofErr w:type="spellEnd"/>
+      <w:r>
+        <w:rPr>
+          <w:lang w:val="en-IN"/>
+        </w:rPr>
+        <w:t xml:space="preserve"> when you are primarily interested in the response body and want a more concise way to retrieve it.</w:t>
       </w:r>
     </w:p>
     <w:p>
@@ -2841,11 +4643,21 @@
           <w:lang w:val="en-IN"/>
         </w:rPr>
       </w:pPr>
-      <w:r>
-        <w:rPr>
-          <w:lang w:val="en-IN"/>
-        </w:rPr>
-        <w:t>getForEntity provides greater flexibility and control over the entire response, making it suitable for cases where you need to examine the response metadata.</w:t>
+      <w:proofErr w:type="spellStart"/>
+      <w:proofErr w:type="gramStart"/>
+      <w:r>
+        <w:rPr>
+          <w:lang w:val="en-IN"/>
+        </w:rPr>
+        <w:t>getForEntity</w:t>
+      </w:r>
+      <w:proofErr w:type="spellEnd"/>
+      <w:proofErr w:type="gramEnd"/>
+      <w:r>
+        <w:rPr>
+          <w:lang w:val="en-IN"/>
+        </w:rPr>
+        <w:t xml:space="preserve"> provides greater flexibility and control over the entire response, making it suitable for cases where you need to examine the response metadata.</w:t>
       </w:r>
     </w:p>
     <w:p>
@@ -2884,11 +4696,35 @@
           <w:lang w:val="en-IN"/>
         </w:rPr>
       </w:pPr>
-      <w:r>
-        <w:rPr>
-          <w:lang w:val="en-IN"/>
-        </w:rPr>
-        <w:t>getForObject is more convenient when you are primarily focused on deserializing the response body into a Java object.</w:t>
+      <w:proofErr w:type="spellStart"/>
+      <w:proofErr w:type="gramStart"/>
+      <w:r>
+        <w:rPr>
+          <w:lang w:val="en-IN"/>
+        </w:rPr>
+        <w:t>getForObject</w:t>
+      </w:r>
+      <w:proofErr w:type="spellEnd"/>
+      <w:proofErr w:type="gramEnd"/>
+      <w:r>
+        <w:rPr>
+          <w:lang w:val="en-IN"/>
+        </w:rPr>
+        <w:t xml:space="preserve"> is more convenient when you are primarily focused on </w:t>
+      </w:r>
+      <w:proofErr w:type="spellStart"/>
+      <w:r>
+        <w:rPr>
+          <w:lang w:val="en-IN"/>
+        </w:rPr>
+        <w:t>deserializing</w:t>
+      </w:r>
+      <w:proofErr w:type="spellEnd"/>
+      <w:r>
+        <w:rPr>
+          <w:lang w:val="en-IN"/>
+        </w:rPr>
+        <w:t xml:space="preserve"> the response body into a Java object.</w:t>
       </w:r>
     </w:p>
     <w:p>
@@ -2910,17 +4746,61 @@
           <w:lang w:val="en-IN"/>
         </w:rPr>
       </w:pPr>
-      <w:r>
-        <w:rPr>
-          <w:lang w:val="en-IN"/>
-        </w:rPr>
-        <w:t>RestTemplate res</w:t>
-      </w:r>
-      <w:r>
-        <w:rPr>
-          <w:lang w:val="en-IN"/>
-        </w:rPr>
-        <w:t>tTemplate = new RestTemplate();</w:t>
+      <w:proofErr w:type="spellStart"/>
+      <w:r>
+        <w:rPr>
+          <w:lang w:val="en-IN"/>
+        </w:rPr>
+        <w:t>RestTemplate</w:t>
+      </w:r>
+      <w:proofErr w:type="spellEnd"/>
+      <w:r>
+        <w:rPr>
+          <w:lang w:val="en-IN"/>
+        </w:rPr>
+        <w:t xml:space="preserve"> </w:t>
+      </w:r>
+      <w:proofErr w:type="spellStart"/>
+      <w:r>
+        <w:rPr>
+          <w:lang w:val="en-IN"/>
+        </w:rPr>
+        <w:t>res</w:t>
+      </w:r>
+      <w:r>
+        <w:rPr>
+          <w:lang w:val="en-IN"/>
+        </w:rPr>
+        <w:t>tTemplate</w:t>
+      </w:r>
+      <w:proofErr w:type="spellEnd"/>
+      <w:r>
+        <w:rPr>
+          <w:lang w:val="en-IN"/>
+        </w:rPr>
+        <w:t xml:space="preserve"> = new </w:t>
+      </w:r>
+      <w:proofErr w:type="spellStart"/>
+      <w:proofErr w:type="gramStart"/>
+      <w:r>
+        <w:rPr>
+          <w:lang w:val="en-IN"/>
+        </w:rPr>
+        <w:t>RestTemplate</w:t>
+      </w:r>
+      <w:proofErr w:type="spellEnd"/>
+      <w:r>
+        <w:rPr>
+          <w:lang w:val="en-IN"/>
+        </w:rPr>
+        <w:t>(</w:t>
+      </w:r>
+      <w:proofErr w:type="gramEnd"/>
+      <w:r>
+        <w:rPr>
+          <w:lang w:val="en-IN"/>
+        </w:rPr>
+        <w:t>);</w:t>
       </w:r>
       <w:r>
         <w:rPr>
@@ -2932,7 +4812,21 @@
         <w:rPr>
           <w:lang w:val="en-IN"/>
         </w:rPr>
-        <w:t xml:space="preserve">String url = </w:t>
+        <w:t xml:space="preserve">String </w:t>
+      </w:r>
+      <w:proofErr w:type="spellStart"/>
+      <w:r>
+        <w:rPr>
+          <w:lang w:val="en-IN"/>
+        </w:rPr>
+        <w:t>url</w:t>
+      </w:r>
+      <w:proofErr w:type="spellEnd"/>
+      <w:r>
+        <w:rPr>
+          <w:lang w:val="en-IN"/>
+        </w:rPr>
+        <w:t xml:space="preserve"> = </w:t>
       </w:r>
       <w:r>
         <w:rPr>
@@ -2946,18 +4840,87 @@
         </w:rPr>
         <w:br/>
       </w:r>
-      <w:r>
-        <w:rPr>
-          <w:lang w:val="en-IN"/>
-        </w:rPr>
-        <w:t>ResponseEntity&lt;String&gt; responseEntity = restTemplate.</w:t>
+      <w:proofErr w:type="spellStart"/>
+      <w:r>
+        <w:rPr>
+          <w:lang w:val="en-IN"/>
+        </w:rPr>
+        <w:t>ResponseEntity</w:t>
+      </w:r>
+      <w:proofErr w:type="spellEnd"/>
+      <w:r>
+        <w:rPr>
+          <w:lang w:val="en-IN"/>
+        </w:rPr>
+        <w:t xml:space="preserve">&lt;String&gt; </w:t>
+      </w:r>
+      <w:proofErr w:type="spellStart"/>
+      <w:r>
+        <w:rPr>
+          <w:lang w:val="en-IN"/>
+        </w:rPr>
+        <w:t>responseEntity</w:t>
+      </w:r>
+      <w:proofErr w:type="spellEnd"/>
+      <w:r>
+        <w:rPr>
+          <w:lang w:val="en-IN"/>
+        </w:rPr>
+        <w:t xml:space="preserve"> = </w:t>
+      </w:r>
+      <w:proofErr w:type="spellStart"/>
+      <w:r>
+        <w:rPr>
+          <w:lang w:val="en-IN"/>
+        </w:rPr>
+        <w:t>restTemplate.</w:t>
       </w:r>
       <w:r>
         <w:rPr>
           <w:b/>
           <w:lang w:val="en-IN"/>
         </w:rPr>
-        <w:t>getForEntity(url, String.class)</w:t>
+        <w:t>getForEntity</w:t>
+      </w:r>
+      <w:proofErr w:type="spellEnd"/>
+      <w:r>
+        <w:rPr>
+          <w:b/>
+          <w:lang w:val="en-IN"/>
+        </w:rPr>
+        <w:t>(</w:t>
+      </w:r>
+      <w:proofErr w:type="spellStart"/>
+      <w:r>
+        <w:rPr>
+          <w:b/>
+          <w:lang w:val="en-IN"/>
+        </w:rPr>
+        <w:t>url</w:t>
+      </w:r>
+      <w:proofErr w:type="spellEnd"/>
+      <w:r>
+        <w:rPr>
+          <w:b/>
+          <w:lang w:val="en-IN"/>
+        </w:rPr>
+        <w:t xml:space="preserve">, </w:t>
+      </w:r>
+      <w:proofErr w:type="spellStart"/>
+      <w:r>
+        <w:rPr>
+          <w:b/>
+          <w:lang w:val="en-IN"/>
+        </w:rPr>
+        <w:t>String.class</w:t>
+      </w:r>
+      <w:proofErr w:type="spellEnd"/>
+      <w:r>
+        <w:rPr>
+          <w:b/>
+          <w:lang w:val="en-IN"/>
+        </w:rPr>
+        <w:t>)</w:t>
       </w:r>
       <w:r>
         <w:rPr>
@@ -2976,14 +4939,77 @@
         <w:rPr>
           <w:lang w:val="en-IN"/>
         </w:rPr>
-        <w:t>String responseBody = restTemplate.</w:t>
+        <w:t xml:space="preserve">String </w:t>
+      </w:r>
+      <w:proofErr w:type="spellStart"/>
+      <w:r>
+        <w:rPr>
+          <w:lang w:val="en-IN"/>
+        </w:rPr>
+        <w:t>responseBody</w:t>
+      </w:r>
+      <w:proofErr w:type="spellEnd"/>
+      <w:r>
+        <w:rPr>
+          <w:lang w:val="en-IN"/>
+        </w:rPr>
+        <w:t xml:space="preserve"> = </w:t>
+      </w:r>
+      <w:proofErr w:type="spellStart"/>
+      <w:proofErr w:type="gramStart"/>
+      <w:r>
+        <w:rPr>
+          <w:lang w:val="en-IN"/>
+        </w:rPr>
+        <w:t>restTemplate.</w:t>
       </w:r>
       <w:r>
         <w:rPr>
           <w:b/>
           <w:lang w:val="en-IN"/>
         </w:rPr>
-        <w:t>getForObject(url, String.class)</w:t>
+        <w:t>getForObject</w:t>
+      </w:r>
+      <w:proofErr w:type="spellEnd"/>
+      <w:r>
+        <w:rPr>
+          <w:b/>
+          <w:lang w:val="en-IN"/>
+        </w:rPr>
+        <w:t>(</w:t>
+      </w:r>
+      <w:proofErr w:type="spellStart"/>
+      <w:proofErr w:type="gramEnd"/>
+      <w:r>
+        <w:rPr>
+          <w:b/>
+          <w:lang w:val="en-IN"/>
+        </w:rPr>
+        <w:t>url</w:t>
+      </w:r>
+      <w:proofErr w:type="spellEnd"/>
+      <w:r>
+        <w:rPr>
+          <w:b/>
+          <w:lang w:val="en-IN"/>
+        </w:rPr>
+        <w:t xml:space="preserve">, </w:t>
+      </w:r>
+      <w:proofErr w:type="spellStart"/>
+      <w:r>
+        <w:rPr>
+          <w:b/>
+          <w:lang w:val="en-IN"/>
+        </w:rPr>
+        <w:t>String.class</w:t>
+      </w:r>
+      <w:proofErr w:type="spellEnd"/>
+      <w:r>
+        <w:rPr>
+          <w:b/>
+          <w:lang w:val="en-IN"/>
+        </w:rPr>
+        <w:t>)</w:t>
       </w:r>
       <w:r>
         <w:rPr>
@@ -2998,17 +5024,89 @@
           <w:lang w:val="en-IN"/>
         </w:rPr>
       </w:pPr>
-      <w:r>
-        <w:rPr>
-          <w:lang w:val="en-IN"/>
-        </w:rPr>
-        <w:t>HttpEntity&lt;MyDataObject&gt; requestEntity = new Http</w:t>
-      </w:r>
-      <w:r>
-        <w:rPr>
-          <w:lang w:val="en-IN"/>
-        </w:rPr>
-        <w:t>Entity&lt;&gt;(requestBody, headers);</w:t>
+      <w:proofErr w:type="spellStart"/>
+      <w:r>
+        <w:rPr>
+          <w:lang w:val="en-IN"/>
+        </w:rPr>
+        <w:t>HttpEntity</w:t>
+      </w:r>
+      <w:proofErr w:type="spellEnd"/>
+      <w:r>
+        <w:rPr>
+          <w:lang w:val="en-IN"/>
+        </w:rPr>
+        <w:t>&lt;</w:t>
+      </w:r>
+      <w:proofErr w:type="spellStart"/>
+      <w:r>
+        <w:rPr>
+          <w:lang w:val="en-IN"/>
+        </w:rPr>
+        <w:t>MyDataObject</w:t>
+      </w:r>
+      <w:proofErr w:type="spellEnd"/>
+      <w:r>
+        <w:rPr>
+          <w:lang w:val="en-IN"/>
+        </w:rPr>
+        <w:t xml:space="preserve">&gt; </w:t>
+      </w:r>
+      <w:proofErr w:type="spellStart"/>
+      <w:r>
+        <w:rPr>
+          <w:lang w:val="en-IN"/>
+        </w:rPr>
+        <w:t>requestEntity</w:t>
+      </w:r>
+      <w:proofErr w:type="spellEnd"/>
+      <w:r>
+        <w:rPr>
+          <w:lang w:val="en-IN"/>
+        </w:rPr>
+        <w:t xml:space="preserve"> = new </w:t>
+      </w:r>
+      <w:proofErr w:type="spellStart"/>
+      <w:r>
+        <w:rPr>
+          <w:lang w:val="en-IN"/>
+        </w:rPr>
+        <w:t>Http</w:t>
+      </w:r>
+      <w:r>
+        <w:rPr>
+          <w:lang w:val="en-IN"/>
+        </w:rPr>
+        <w:t>Entity</w:t>
+      </w:r>
+      <w:proofErr w:type="spellEnd"/>
+      <w:r>
+        <w:rPr>
+          <w:lang w:val="en-IN"/>
+        </w:rPr>
+        <w:t>&lt;</w:t>
+      </w:r>
+      <w:proofErr w:type="gramStart"/>
+      <w:r>
+        <w:rPr>
+          <w:lang w:val="en-IN"/>
+        </w:rPr>
+        <w:t>&gt;(</w:t>
+      </w:r>
+      <w:proofErr w:type="spellStart"/>
+      <w:proofErr w:type="gramEnd"/>
+      <w:r>
+        <w:rPr>
+          <w:lang w:val="en-IN"/>
+        </w:rPr>
+        <w:t>requestBody</w:t>
+      </w:r>
+      <w:proofErr w:type="spellEnd"/>
+      <w:r>
+        <w:rPr>
+          <w:lang w:val="en-IN"/>
+        </w:rPr>
+        <w:t>, headers);</w:t>
       </w:r>
       <w:r>
         <w:rPr>
@@ -3016,11 +5114,40 @@
         </w:rPr>
         <w:br/>
       </w:r>
-      <w:r>
-        <w:rPr>
-          <w:lang w:val="en-IN"/>
-        </w:rPr>
-        <w:t>ResponseEntity&lt;String&gt; responseEntity = restTemplate.</w:t>
+      <w:proofErr w:type="spellStart"/>
+      <w:r>
+        <w:rPr>
+          <w:lang w:val="en-IN"/>
+        </w:rPr>
+        <w:t>ResponseEntity</w:t>
+      </w:r>
+      <w:proofErr w:type="spellEnd"/>
+      <w:r>
+        <w:rPr>
+          <w:lang w:val="en-IN"/>
+        </w:rPr>
+        <w:t xml:space="preserve">&lt;String&gt; </w:t>
+      </w:r>
+      <w:proofErr w:type="spellStart"/>
+      <w:r>
+        <w:rPr>
+          <w:lang w:val="en-IN"/>
+        </w:rPr>
+        <w:t>responseEntity</w:t>
+      </w:r>
+      <w:proofErr w:type="spellEnd"/>
+      <w:r>
+        <w:rPr>
+          <w:lang w:val="en-IN"/>
+        </w:rPr>
+        <w:t xml:space="preserve"> = </w:t>
+      </w:r>
+      <w:proofErr w:type="spellStart"/>
+      <w:r>
+        <w:rPr>
+          <w:lang w:val="en-IN"/>
+        </w:rPr>
+        <w:t>restTemplate.</w:t>
       </w:r>
       <w:r>
         <w:rPr>
@@ -3029,37 +5156,166 @@
         </w:rPr>
         <w:t>postForEntity</w:t>
       </w:r>
-      <w:r>
-        <w:rPr>
-          <w:lang w:val="en-IN"/>
-        </w:rPr>
-        <w:t>(url, requestEntity, String.class);</w:t>
-      </w:r>
-    </w:p>
-    <w:p>
-      <w:pPr>
-        <w:rPr>
-          <w:lang w:val="en-IN"/>
-        </w:rPr>
-      </w:pPr>
-      <w:r>
-        <w:rPr>
-          <w:lang w:val="en-IN"/>
-        </w:rPr>
-        <w:t>// Create a request entity with the JSON object and headers</w:t>
-      </w:r>
-    </w:p>
-    <w:p>
-      <w:pPr>
-        <w:rPr>
-          <w:lang w:val="en-IN"/>
-        </w:rPr>
-      </w:pPr>
-      <w:r>
-        <w:rPr>
-          <w:lang w:val="en-IN"/>
-        </w:rPr>
-        <w:t>HttpEntity&lt;MyDataObject&gt; requestEntity = new HttpEntity&lt;&gt;(requestBody, headers);</w:t>
+      <w:proofErr w:type="spellEnd"/>
+      <w:r>
+        <w:rPr>
+          <w:lang w:val="en-IN"/>
+        </w:rPr>
+        <w:t>(</w:t>
+      </w:r>
+      <w:proofErr w:type="spellStart"/>
+      <w:r>
+        <w:rPr>
+          <w:lang w:val="en-IN"/>
+        </w:rPr>
+        <w:t>url</w:t>
+      </w:r>
+      <w:proofErr w:type="spellEnd"/>
+      <w:r>
+        <w:rPr>
+          <w:lang w:val="en-IN"/>
+        </w:rPr>
+        <w:t xml:space="preserve">, </w:t>
+      </w:r>
+      <w:proofErr w:type="spellStart"/>
+      <w:r>
+        <w:rPr>
+          <w:lang w:val="en-IN"/>
+        </w:rPr>
+        <w:t>requestEntity</w:t>
+      </w:r>
+      <w:proofErr w:type="spellEnd"/>
+      <w:r>
+        <w:rPr>
+          <w:lang w:val="en-IN"/>
+        </w:rPr>
+        <w:t xml:space="preserve">, </w:t>
+      </w:r>
+      <w:proofErr w:type="spellStart"/>
+      <w:r>
+        <w:rPr>
+          <w:lang w:val="en-IN"/>
+        </w:rPr>
+        <w:t>String.class</w:t>
+      </w:r>
+      <w:proofErr w:type="spellEnd"/>
+      <w:r>
+        <w:rPr>
+          <w:lang w:val="en-IN"/>
+        </w:rPr>
+        <w:t>);</w:t>
+      </w:r>
+    </w:p>
+    <w:p>
+      <w:pPr>
+        <w:rPr>
+          <w:lang w:val="en-IN"/>
+        </w:rPr>
+      </w:pPr>
+      <w:r>
+        <w:rPr>
+          <w:lang w:val="en-IN"/>
+        </w:rPr>
+        <w:t xml:space="preserve">// </w:t>
+      </w:r>
+      <w:proofErr w:type="gramStart"/>
+      <w:r>
+        <w:rPr>
+          <w:lang w:val="en-IN"/>
+        </w:rPr>
+        <w:t>Create</w:t>
+      </w:r>
+      <w:proofErr w:type="gramEnd"/>
+      <w:r>
+        <w:rPr>
+          <w:lang w:val="en-IN"/>
+        </w:rPr>
+        <w:t xml:space="preserve"> a request entity with the JSON object and headers</w:t>
+      </w:r>
+    </w:p>
+    <w:p>
+      <w:pPr>
+        <w:rPr>
+          <w:lang w:val="en-IN"/>
+        </w:rPr>
+      </w:pPr>
+      <w:proofErr w:type="spellStart"/>
+      <w:r>
+        <w:rPr>
+          <w:lang w:val="en-IN"/>
+        </w:rPr>
+        <w:t>HttpEntity</w:t>
+      </w:r>
+      <w:proofErr w:type="spellEnd"/>
+      <w:r>
+        <w:rPr>
+          <w:lang w:val="en-IN"/>
+        </w:rPr>
+        <w:t>&lt;</w:t>
+      </w:r>
+      <w:proofErr w:type="spellStart"/>
+      <w:r>
+        <w:rPr>
+          <w:lang w:val="en-IN"/>
+        </w:rPr>
+        <w:t>MyDataObject</w:t>
+      </w:r>
+      <w:proofErr w:type="spellEnd"/>
+      <w:r>
+        <w:rPr>
+          <w:lang w:val="en-IN"/>
+        </w:rPr>
+        <w:t xml:space="preserve">&gt; </w:t>
+      </w:r>
+      <w:proofErr w:type="spellStart"/>
+      <w:r>
+        <w:rPr>
+          <w:lang w:val="en-IN"/>
+        </w:rPr>
+        <w:t>requestEntity</w:t>
+      </w:r>
+      <w:proofErr w:type="spellEnd"/>
+      <w:r>
+        <w:rPr>
+          <w:lang w:val="en-IN"/>
+        </w:rPr>
+        <w:t xml:space="preserve"> = new </w:t>
+      </w:r>
+      <w:proofErr w:type="spellStart"/>
+      <w:r>
+        <w:rPr>
+          <w:lang w:val="en-IN"/>
+        </w:rPr>
+        <w:t>HttpEntity</w:t>
+      </w:r>
+      <w:proofErr w:type="spellEnd"/>
+      <w:r>
+        <w:rPr>
+          <w:lang w:val="en-IN"/>
+        </w:rPr>
+        <w:t>&lt;</w:t>
+      </w:r>
+      <w:proofErr w:type="gramStart"/>
+      <w:r>
+        <w:rPr>
+          <w:lang w:val="en-IN"/>
+        </w:rPr>
+        <w:t>&gt;(</w:t>
+      </w:r>
+      <w:proofErr w:type="spellStart"/>
+      <w:proofErr w:type="gramEnd"/>
+      <w:r>
+        <w:rPr>
+          <w:lang w:val="en-IN"/>
+        </w:rPr>
+        <w:t>requestBody</w:t>
+      </w:r>
+      <w:proofErr w:type="spellEnd"/>
+      <w:r>
+        <w:rPr>
+          <w:lang w:val="en-IN"/>
+        </w:rPr>
+        <w:t>, headers);</w:t>
       </w:r>
     </w:p>
     <w:p>
@@ -3085,7 +5341,29 @@
         <w:rPr>
           <w:lang w:val="en-IN"/>
         </w:rPr>
-        <w:t>String responseBody = restTemplate.</w:t>
+        <w:t xml:space="preserve">String </w:t>
+      </w:r>
+      <w:proofErr w:type="spellStart"/>
+      <w:r>
+        <w:rPr>
+          <w:lang w:val="en-IN"/>
+        </w:rPr>
+        <w:t>responseBody</w:t>
+      </w:r>
+      <w:proofErr w:type="spellEnd"/>
+      <w:r>
+        <w:rPr>
+          <w:lang w:val="en-IN"/>
+        </w:rPr>
+        <w:t xml:space="preserve"> = </w:t>
+      </w:r>
+      <w:proofErr w:type="spellStart"/>
+      <w:proofErr w:type="gramStart"/>
+      <w:r>
+        <w:rPr>
+          <w:lang w:val="en-IN"/>
+        </w:rPr>
+        <w:t>restTemplate.</w:t>
       </w:r>
       <w:r>
         <w:rPr>
@@ -3094,24 +5372,92 @@
         </w:rPr>
         <w:t>postForObject</w:t>
       </w:r>
-      <w:r>
-        <w:rPr>
-          <w:lang w:val="en-IN"/>
-        </w:rPr>
-        <w:t>(url, requestEntity, String.class);</w:t>
-      </w:r>
-    </w:p>
-    <w:p>
-      <w:pPr>
-        <w:rPr>
-          <w:lang w:val="en-IN"/>
-        </w:rPr>
-      </w:pPr>
-      <w:r>
-        <w:rPr>
-          <w:lang w:val="en-IN"/>
-        </w:rPr>
-        <w:t>restTemplate.delete(url);</w:t>
+      <w:proofErr w:type="spellEnd"/>
+      <w:r>
+        <w:rPr>
+          <w:lang w:val="en-IN"/>
+        </w:rPr>
+        <w:t>(</w:t>
+      </w:r>
+      <w:proofErr w:type="spellStart"/>
+      <w:proofErr w:type="gramEnd"/>
+      <w:r>
+        <w:rPr>
+          <w:lang w:val="en-IN"/>
+        </w:rPr>
+        <w:t>url</w:t>
+      </w:r>
+      <w:proofErr w:type="spellEnd"/>
+      <w:r>
+        <w:rPr>
+          <w:lang w:val="en-IN"/>
+        </w:rPr>
+        <w:t xml:space="preserve">, </w:t>
+      </w:r>
+      <w:proofErr w:type="spellStart"/>
+      <w:r>
+        <w:rPr>
+          <w:lang w:val="en-IN"/>
+        </w:rPr>
+        <w:t>requestEntity</w:t>
+      </w:r>
+      <w:proofErr w:type="spellEnd"/>
+      <w:r>
+        <w:rPr>
+          <w:lang w:val="en-IN"/>
+        </w:rPr>
+        <w:t xml:space="preserve">, </w:t>
+      </w:r>
+      <w:proofErr w:type="spellStart"/>
+      <w:r>
+        <w:rPr>
+          <w:lang w:val="en-IN"/>
+        </w:rPr>
+        <w:t>String.class</w:t>
+      </w:r>
+      <w:proofErr w:type="spellEnd"/>
+      <w:r>
+        <w:rPr>
+          <w:lang w:val="en-IN"/>
+        </w:rPr>
+        <w:t>);</w:t>
+      </w:r>
+    </w:p>
+    <w:p>
+      <w:pPr>
+        <w:rPr>
+          <w:lang w:val="en-IN"/>
+        </w:rPr>
+      </w:pPr>
+      <w:proofErr w:type="spellStart"/>
+      <w:proofErr w:type="gramStart"/>
+      <w:r>
+        <w:rPr>
+          <w:lang w:val="en-IN"/>
+        </w:rPr>
+        <w:t>restTemplate.delete</w:t>
+      </w:r>
+      <w:proofErr w:type="spellEnd"/>
+      <w:r>
+        <w:rPr>
+          <w:lang w:val="en-IN"/>
+        </w:rPr>
+        <w:t>(</w:t>
+      </w:r>
+      <w:proofErr w:type="spellStart"/>
+      <w:proofErr w:type="gramEnd"/>
+      <w:r>
+        <w:rPr>
+          <w:lang w:val="en-IN"/>
+        </w:rPr>
+        <w:t>url</w:t>
+      </w:r>
+      <w:proofErr w:type="spellEnd"/>
+      <w:r>
+        <w:rPr>
+          <w:lang w:val="en-IN"/>
+        </w:rPr>
+        <w:t>);</w:t>
       </w:r>
     </w:p>
     <w:p>
@@ -3302,7 +5648,27 @@
                 <w:szCs w:val="24"/>
                 <w:lang w:bidi="hi-IN"/>
               </w:rPr>
-              <w:t>Collects and stores real-time metrics (like CPU, memory, request rate) from microservices for monitoring and alerting.</w:t>
+              <w:t xml:space="preserve">Collects and stores real-time metrics (like CPU, memory, </w:t>
+            </w:r>
+            <w:proofErr w:type="gramStart"/>
+            <w:r>
+              <w:rPr>
+                <w:rFonts w:ascii="Times New Roman" w:eastAsia="Times New Roman" w:hAnsi="Times New Roman" w:cs="Times New Roman"/>
+                <w:sz w:val="24"/>
+                <w:szCs w:val="24"/>
+                <w:lang w:bidi="hi-IN"/>
+              </w:rPr>
+              <w:t>request</w:t>
+            </w:r>
+            <w:proofErr w:type="gramEnd"/>
+            <w:r>
+              <w:rPr>
+                <w:rFonts w:ascii="Times New Roman" w:eastAsia="Times New Roman" w:hAnsi="Times New Roman" w:cs="Times New Roman"/>
+                <w:sz w:val="24"/>
+                <w:szCs w:val="24"/>
+                <w:lang w:bidi="hi-IN"/>
+              </w:rPr>
+              <w:t xml:space="preserve"> rate) from microservices for monitoring and alerting.</w:t>
             </w:r>
           </w:p>
         </w:tc>
@@ -3327,6 +5693,7 @@
                 <w:lang w:bidi="hi-IN"/>
               </w:rPr>
             </w:pPr>
+            <w:proofErr w:type="spellStart"/>
             <w:r>
               <w:rPr>
                 <w:rFonts w:ascii="Times New Roman" w:eastAsia="Times New Roman" w:hAnsi="Times New Roman" w:cs="Times New Roman"/>
@@ -3338,6 +5705,7 @@
               </w:rPr>
               <w:t>Grafana</w:t>
             </w:r>
+            <w:proofErr w:type="spellEnd"/>
           </w:p>
         </w:tc>
         <w:tc>
@@ -3397,7 +5765,79 @@
                 <w:szCs w:val="24"/>
                 <w:lang w:bidi="hi-IN"/>
               </w:rPr>
-              <w:t>ELK Stack (Elasticsearch, Logstash, Kibana)</w:t>
+              <w:t>ELK Stack (</w:t>
+            </w:r>
+            <w:proofErr w:type="spellStart"/>
+            <w:r>
+              <w:rPr>
+                <w:rFonts w:ascii="Times New Roman" w:eastAsia="Times New Roman" w:hAnsi="Times New Roman" w:cs="Times New Roman"/>
+                <w:b/>
+                <w:bCs/>
+                <w:sz w:val="24"/>
+                <w:szCs w:val="24"/>
+                <w:lang w:bidi="hi-IN"/>
+              </w:rPr>
+              <w:t>Elasticsearch</w:t>
+            </w:r>
+            <w:proofErr w:type="spellEnd"/>
+            <w:r>
+              <w:rPr>
+                <w:rFonts w:ascii="Times New Roman" w:eastAsia="Times New Roman" w:hAnsi="Times New Roman" w:cs="Times New Roman"/>
+                <w:b/>
+                <w:bCs/>
+                <w:sz w:val="24"/>
+                <w:szCs w:val="24"/>
+                <w:lang w:bidi="hi-IN"/>
+              </w:rPr>
+              <w:t xml:space="preserve">, </w:t>
+            </w:r>
+            <w:proofErr w:type="spellStart"/>
+            <w:r>
+              <w:rPr>
+                <w:rFonts w:ascii="Times New Roman" w:eastAsia="Times New Roman" w:hAnsi="Times New Roman" w:cs="Times New Roman"/>
+                <w:b/>
+                <w:bCs/>
+                <w:sz w:val="24"/>
+                <w:szCs w:val="24"/>
+                <w:lang w:bidi="hi-IN"/>
+              </w:rPr>
+              <w:t>Logstash</w:t>
+            </w:r>
+            <w:proofErr w:type="spellEnd"/>
+            <w:r>
+              <w:rPr>
+                <w:rFonts w:ascii="Times New Roman" w:eastAsia="Times New Roman" w:hAnsi="Times New Roman" w:cs="Times New Roman"/>
+                <w:b/>
+                <w:bCs/>
+                <w:sz w:val="24"/>
+                <w:szCs w:val="24"/>
+                <w:lang w:bidi="hi-IN"/>
+              </w:rPr>
+              <w:t xml:space="preserve">, </w:t>
+            </w:r>
+            <w:proofErr w:type="spellStart"/>
+            <w:r>
+              <w:rPr>
+                <w:rFonts w:ascii="Times New Roman" w:eastAsia="Times New Roman" w:hAnsi="Times New Roman" w:cs="Times New Roman"/>
+                <w:b/>
+                <w:bCs/>
+                <w:sz w:val="24"/>
+                <w:szCs w:val="24"/>
+                <w:lang w:bidi="hi-IN"/>
+              </w:rPr>
+              <w:t>Kibana</w:t>
+            </w:r>
+            <w:proofErr w:type="spellEnd"/>
+            <w:r>
+              <w:rPr>
+                <w:rFonts w:ascii="Times New Roman" w:eastAsia="Times New Roman" w:hAnsi="Times New Roman" w:cs="Times New Roman"/>
+                <w:b/>
+                <w:bCs/>
+                <w:sz w:val="24"/>
+                <w:szCs w:val="24"/>
+                <w:lang w:bidi="hi-IN"/>
+              </w:rPr>
+              <w:t>)</w:t>
             </w:r>
           </w:p>
         </w:tc>
@@ -3449,6 +5889,7 @@
                 <w:lang w:bidi="hi-IN"/>
               </w:rPr>
             </w:pPr>
+            <w:proofErr w:type="spellStart"/>
             <w:r>
               <w:rPr>
                 <w:rFonts w:ascii="Times New Roman" w:eastAsia="Times New Roman" w:hAnsi="Times New Roman" w:cs="Times New Roman"/>
@@ -3460,6 +5901,7 @@
               </w:rPr>
               <w:t>Kibana</w:t>
             </w:r>
+            <w:proofErr w:type="spellEnd"/>
           </w:p>
         </w:tc>
         <w:tc>
@@ -3485,7 +5927,27 @@
                 <w:szCs w:val="24"/>
                 <w:lang w:bidi="hi-IN"/>
               </w:rPr>
-              <w:t>Front-end visualization tool of the ELK Stack, used to query and visualize logs and application errors from Elasticsearch.</w:t>
+              <w:t xml:space="preserve">Front-end visualization tool of the ELK Stack, used to query and visualize logs and application errors from </w:t>
+            </w:r>
+            <w:proofErr w:type="spellStart"/>
+            <w:r>
+              <w:rPr>
+                <w:rFonts w:ascii="Times New Roman" w:eastAsia="Times New Roman" w:hAnsi="Times New Roman" w:cs="Times New Roman"/>
+                <w:sz w:val="24"/>
+                <w:szCs w:val="24"/>
+                <w:lang w:bidi="hi-IN"/>
+              </w:rPr>
+              <w:t>Elasticsearch</w:t>
+            </w:r>
+            <w:proofErr w:type="spellEnd"/>
+            <w:r>
+              <w:rPr>
+                <w:rFonts w:ascii="Times New Roman" w:eastAsia="Times New Roman" w:hAnsi="Times New Roman" w:cs="Times New Roman"/>
+                <w:sz w:val="24"/>
+                <w:szCs w:val="24"/>
+                <w:lang w:bidi="hi-IN"/>
+              </w:rPr>
+              <w:t>.</w:t>
             </w:r>
           </w:p>
         </w:tc>
@@ -3539,6 +6001,7 @@
                 <w:lang w:bidi="hi-IN"/>
               </w:rPr>
             </w:pPr>
+            <w:proofErr w:type="gramStart"/>
             <w:r>
               <w:rPr>
                 <w:rFonts w:ascii="Times New Roman" w:eastAsia="Times New Roman" w:hAnsi="Times New Roman" w:cs="Times New Roman"/>
@@ -3546,7 +6009,17 @@
                 <w:szCs w:val="24"/>
                 <w:lang w:bidi="hi-IN"/>
               </w:rPr>
-              <w:t>Adds trace IDs and span IDs to logs, enabling correlation of logs across different microservices in a distributed system.</w:t>
+              <w:t>Adds</w:t>
+            </w:r>
+            <w:proofErr w:type="gramEnd"/>
+            <w:r>
+              <w:rPr>
+                <w:rFonts w:ascii="Times New Roman" w:eastAsia="Times New Roman" w:hAnsi="Times New Roman" w:cs="Times New Roman"/>
+                <w:sz w:val="24"/>
+                <w:szCs w:val="24"/>
+                <w:lang w:bidi="hi-IN"/>
+              </w:rPr>
+              <w:t xml:space="preserve"> trace IDs and span IDs to logs, enabling correlation of logs across different microservices in a distributed system.</w:t>
             </w:r>
           </w:p>
         </w:tc>
@@ -3571,6 +6044,7 @@
                 <w:lang w:bidi="hi-IN"/>
               </w:rPr>
             </w:pPr>
+            <w:proofErr w:type="spellStart"/>
             <w:r>
               <w:rPr>
                 <w:rFonts w:ascii="Times New Roman" w:eastAsia="Times New Roman" w:hAnsi="Times New Roman" w:cs="Times New Roman"/>
@@ -3582,6 +6056,7 @@
               </w:rPr>
               <w:t>Zipkin</w:t>
             </w:r>
+            <w:proofErr w:type="spellEnd"/>
           </w:p>
         </w:tc>
         <w:tc>
@@ -3679,6 +6154,7 @@
               </w:rPr>
               <w:t xml:space="preserve">arbage </w:t>
             </w:r>
+            <w:proofErr w:type="spellStart"/>
             <w:r>
               <w:rPr>
                 <w:rFonts w:ascii="Times New Roman" w:eastAsia="Times New Roman" w:hAnsi="Times New Roman" w:cs="Times New Roman"/>
@@ -3697,6 +6173,7 @@
               </w:rPr>
               <w:t>olection</w:t>
             </w:r>
+            <w:proofErr w:type="spellEnd"/>
             <w:r>
               <w:rPr>
                 <w:rFonts w:ascii="Times New Roman" w:eastAsia="Times New Roman" w:hAnsi="Times New Roman" w:cs="Times New Roman"/>
@@ -6544,7 +9021,7 @@
 </file>
 
 <file path=customXml/itemProps1.xml><?xml version="1.0" encoding="utf-8"?>
-<ds:datastoreItem xmlns:ds="http://schemas.openxmlformats.org/officeDocument/2006/customXml" ds:itemID="{D54393B4-64A7-42CC-85BC-1FEDAF7C9244}">
+<ds:datastoreItem xmlns:ds="http://schemas.openxmlformats.org/officeDocument/2006/customXml" ds:itemID="{093FA88B-6FA4-4308-9CAD-E3A4C5A752B6}">
   <ds:schemaRefs>
     <ds:schemaRef ds:uri="http://schemas.openxmlformats.org/officeDocument/2006/bibliography"/>
   </ds:schemaRefs>

</xml_diff>